<commit_message>
N.D. Ga. complaint: typst and docx on the shared cross-engine layout model, Times New Roman 14 pt on both (LR 5.1(C); 32.2 pt double pitch as before, 16.1 pt single lines; 14 pt footnotes in 16.1 pt boxes); make-reference.sh and reference.docx give way to docx/reference.xml (base="xengine", {font}, footer 686 tw); gand-complaint.lua writes the court title, the caption as one-line rows (case number on the middle row, jury demand two rows below), headings, lettered prayer items and signature with xe spacing, body paragraphs stay pandoc Body Text so the footnote is a Word footnote; a space before a note dropped, §§ and ')(' bound alike. XENG-001..003 pass (258/258 lines), params.cross_engine: gate; typst 9 and docx 13 passed, 0 failed (fb-595.68.12) (its make-reference.sh and reference.docx deletions went in with ba3999ce9, a shared index) (fb-595.68.12)
</commit_message>
<xml_diff>
--- a/courts/eleventh-circuit/georgia/federal/northern-district/complaint/usage/OUTPUT-complaint.docx
+++ b/courts/eleventh-circuit/georgia/federal/northern-district/complaint/usage/OUTPUT-complaint.docx
@@ -4,45 +4,57 @@
   <w:body>
     <w:p>
       <w:pPr>
-        <w:pStyle w:val="GANDCourtTitle"/>
-      </w:pPr>
-      <w:r>
+        <w:spacing w:before="0" w:after="0" w:line="322" w:lineRule="exact"/>
+        <w:ind w:left="0" w:firstLine="0"/>
+        <w:jc w:val="center"/>
+      </w:pPr>
+      <w:r>
+        <w:rPr>
+          <w:b/>
+          <w:bCs/>
+        </w:rPr>
         <w:t xml:space="preserve">IN THE UNITED STATES DISTRICT COURT</w:t>
       </w:r>
     </w:p>
     <w:p>
       <w:pPr>
-        <w:pStyle w:val="GANDCourtTitle"/>
-      </w:pPr>
-      <w:r>
+        <w:spacing w:before="0" w:after="0" w:line="322" w:lineRule="exact"/>
+        <w:ind w:left="0" w:firstLine="0"/>
+        <w:jc w:val="center"/>
+      </w:pPr>
+      <w:r>
+        <w:rPr>
+          <w:b/>
+          <w:bCs/>
+        </w:rPr>
         <w:t xml:space="preserve">FOR THE NORTHERN DISTRICT OF GEORGIA</w:t>
       </w:r>
     </w:p>
     <w:p>
       <w:pPr>
-        <w:pStyle w:val="GANDCourtTitleLast"/>
-      </w:pPr>
-      <w:r>
+        <w:spacing w:before="0" w:after="322" w:line="322" w:lineRule="exact"/>
+        <w:ind w:left="0" w:firstLine="0"/>
+        <w:jc w:val="center"/>
+      </w:pPr>
+      <w:r>
+        <w:rPr>
+          <w:b/>
+          <w:bCs/>
+        </w:rPr>
         <w:t xml:space="preserve">ROME DIVISION</w:t>
       </w:r>
     </w:p>
     <w:tbl>
       <w:tblPr>
         <w:tblW w:w="9360" w:type="dxa"/>
-        <w:tblBorders>
-          <w:top w:val="nil"/>
-          <w:left w:val="nil"/>
-          <w:bottom w:val="nil"/>
-          <w:right w:val="nil"/>
-          <w:insideH w:val="nil"/>
-          <w:insideV w:val="nil"/>
-        </w:tblBorders>
         <w:tblLayout w:type="fixed"/>
         <w:tblCellMar>
+          <w:top w:w="0" w:type="dxa"/>
           <w:left w:w="0" w:type="dxa"/>
+          <w:bottom w:w="0" w:type="dxa"/>
           <w:right w:w="0" w:type="dxa"/>
         </w:tblCellMar>
-        <w:tblLook w:val="0000"/>
+        <w:tblLook w:val="0000" w:firstRow="0" w:lastRow="0" w:firstColumn="0" w:lastColumn="0" w:noHBand="0" w:noVBand="0"/>
       </w:tblPr>
       <w:tblGrid>
         <w:gridCol w:w="4608"/>
@@ -51,7 +63,7 @@
       </w:tblGrid>
       <w:tr>
         <w:trPr>
-          <w:trHeight w:val="392" w:hRule="exact"/>
+          <w:trHeight w:val="322" w:hRule="exact"/>
         </w:trPr>
         <w:tc>
           <w:tcPr>
@@ -59,10 +71,30 @@
           </w:tcPr>
           <w:p>
             <w:pPr>
-              <w:pStyle w:val="GANDCaption"/>
+              <w:spacing w:before="0" w:after="0" w:line="322" w:lineRule="exact"/>
+              <w:ind w:left="0" w:firstLine="0"/>
+              <w:jc w:val="left"/>
             </w:pPr>
             <w:r>
-              <w:t xml:space="preserve">SERVECO NORTH AMERICA LLC,</w:t>
+              <w:t xml:space="preserve">SERVECO</w:t>
+            </w:r>
+            <w:r>
+              <w:t xml:space="preserve"> </w:t>
+            </w:r>
+            <w:r>
+              <w:t xml:space="preserve">NORTH</w:t>
+            </w:r>
+            <w:r>
+              <w:t xml:space="preserve"> </w:t>
+            </w:r>
+            <w:r>
+              <w:t xml:space="preserve">AMERICA</w:t>
+            </w:r>
+            <w:r>
+              <w:t xml:space="preserve"> </w:t>
+            </w:r>
+            <w:r>
+              <w:t xml:space="preserve">LLC,</w:t>
             </w:r>
           </w:p>
         </w:tc>
@@ -72,7 +104,9 @@
           </w:tcPr>
           <w:p>
             <w:pPr>
-              <w:pStyle w:val="GANDCaption"/>
+              <w:spacing w:before="0" w:after="0" w:line="322" w:lineRule="exact"/>
+              <w:ind w:left="0" w:firstLine="0"/>
+              <w:jc w:val="left"/>
             </w:pPr>
             <w:r>
               <w:t xml:space="preserve">)</w:t>
@@ -82,31 +116,19 @@
         <w:tc>
           <w:tcPr>
             <w:tcW w:w="4248" w:type="dxa"/>
-            <w:vMerge w:val="restart"/>
-            <w:vAlign w:val="center"/>
           </w:tcPr>
           <w:p>
             <w:pPr>
-              <w:pStyle w:val="GANDCaption"/>
+              <w:spacing w:before="0" w:after="0" w:line="322" w:lineRule="exact"/>
+              <w:ind w:left="0" w:firstLine="0"/>
+              <w:jc w:val="left"/>
             </w:pPr>
-            <w:r>
-              <w:t xml:space="preserve">Civil Action No. ______________</w:t>
-            </w:r>
-          </w:p>
-          <w:p>
-            <w:pPr>
-              <w:pStyle w:val="GANDCaption"/>
-              <w:spacing w:before="392" w:after="0" w:line="392" w:lineRule="exact"/>
-            </w:pPr>
-            <w:r>
-              <w:t xml:space="preserve">JURY TRIAL DEMANDED</w:t>
-            </w:r>
           </w:p>
         </w:tc>
       </w:tr>
       <w:tr>
         <w:trPr>
-          <w:trHeight w:val="392" w:hRule="exact"/>
+          <w:trHeight w:val="322" w:hRule="exact"/>
         </w:trPr>
         <w:tc>
           <w:tcPr>
@@ -114,8 +136,9 @@
           </w:tcPr>
           <w:p>
             <w:pPr>
-              <w:pStyle w:val="GANDCaption"/>
-              <w:ind w:left="2160"/>
+              <w:spacing w:before="0" w:after="0" w:line="322" w:lineRule="exact"/>
+              <w:ind w:left="2160" w:firstLine="0"/>
+              <w:jc w:val="left"/>
             </w:pPr>
             <w:r>
               <w:t xml:space="preserve">Plaintiff,</w:t>
@@ -128,7 +151,9 @@
           </w:tcPr>
           <w:p>
             <w:pPr>
-              <w:pStyle w:val="GANDCaption"/>
+              <w:spacing w:before="0" w:after="0" w:line="322" w:lineRule="exact"/>
+              <w:ind w:left="0" w:firstLine="0"/>
+              <w:jc w:val="left"/>
             </w:pPr>
             <w:r>
               <w:t xml:space="preserve">)</w:t>
@@ -138,18 +163,19 @@
         <w:tc>
           <w:tcPr>
             <w:tcW w:w="4248" w:type="dxa"/>
-            <w:vMerge/>
           </w:tcPr>
           <w:p>
             <w:pPr>
-              <w:pStyle w:val="GANDCaption"/>
+              <w:spacing w:before="0" w:after="0" w:line="322" w:lineRule="exact"/>
+              <w:ind w:left="0" w:firstLine="0"/>
+              <w:jc w:val="left"/>
             </w:pPr>
           </w:p>
         </w:tc>
       </w:tr>
       <w:tr>
         <w:trPr>
-          <w:trHeight w:val="392" w:hRule="exact"/>
+          <w:trHeight w:val="322" w:hRule="exact"/>
         </w:trPr>
         <w:tc>
           <w:tcPr>
@@ -157,7 +183,9 @@
           </w:tcPr>
           <w:p>
             <w:pPr>
-              <w:pStyle w:val="GANDCaption"/>
+              <w:spacing w:before="0" w:after="0" w:line="322" w:lineRule="exact"/>
+              <w:ind w:left="0" w:firstLine="0"/>
+              <w:jc w:val="left"/>
             </w:pPr>
             <w:r>
               <w:t xml:space="preserve">v.</w:t>
@@ -170,7 +198,9 @@
           </w:tcPr>
           <w:p>
             <w:pPr>
-              <w:pStyle w:val="GANDCaption"/>
+              <w:spacing w:before="0" w:after="0" w:line="322" w:lineRule="exact"/>
+              <w:ind w:left="0" w:firstLine="0"/>
+              <w:jc w:val="left"/>
             </w:pPr>
             <w:r>
               <w:t xml:space="preserve">)</w:t>
@@ -180,18 +210,22 @@
         <w:tc>
           <w:tcPr>
             <w:tcW w:w="4248" w:type="dxa"/>
-            <w:vMerge/>
           </w:tcPr>
           <w:p>
             <w:pPr>
-              <w:pStyle w:val="GANDCaption"/>
+              <w:spacing w:before="0" w:after="0" w:line="322" w:lineRule="exact"/>
+              <w:ind w:left="0" w:firstLine="0"/>
+              <w:jc w:val="left"/>
             </w:pPr>
+            <w:r>
+              <w:t xml:space="preserve">Civil Action No. ______________</w:t>
+            </w:r>
           </w:p>
         </w:tc>
       </w:tr>
       <w:tr>
         <w:trPr>
-          <w:trHeight w:val="392" w:hRule="exact"/>
+          <w:trHeight w:val="322" w:hRule="exact"/>
         </w:trPr>
         <w:tc>
           <w:tcPr>
@@ -199,10 +233,24 @@
           </w:tcPr>
           <w:p>
             <w:pPr>
-              <w:pStyle w:val="GANDCaption"/>
+              <w:spacing w:before="0" w:after="0" w:line="322" w:lineRule="exact"/>
+              <w:ind w:left="0" w:firstLine="0"/>
+              <w:jc w:val="left"/>
             </w:pPr>
             <w:r>
-              <w:t xml:space="preserve">GUMERSINDO MARTINEZ, a/k/a</w:t>
+              <w:t xml:space="preserve">GUMERSINDO</w:t>
+            </w:r>
+            <w:r>
+              <w:t xml:space="preserve"> </w:t>
+            </w:r>
+            <w:r>
+              <w:t xml:space="preserve">MARTINEZ,</w:t>
+            </w:r>
+            <w:r>
+              <w:t xml:space="preserve"> </w:t>
+            </w:r>
+            <w:r>
+              <w:t xml:space="preserve">a/​k/​a</w:t>
             </w:r>
           </w:p>
         </w:tc>
@@ -212,7 +260,9 @@
           </w:tcPr>
           <w:p>
             <w:pPr>
-              <w:pStyle w:val="GANDCaption"/>
+              <w:spacing w:before="0" w:after="0" w:line="322" w:lineRule="exact"/>
+              <w:ind w:left="0" w:firstLine="0"/>
+              <w:jc w:val="left"/>
             </w:pPr>
             <w:r>
               <w:t xml:space="preserve">)</w:t>
@@ -222,18 +272,19 @@
         <w:tc>
           <w:tcPr>
             <w:tcW w:w="4248" w:type="dxa"/>
-            <w:vMerge/>
           </w:tcPr>
           <w:p>
             <w:pPr>
-              <w:pStyle w:val="GANDCaption"/>
+              <w:spacing w:before="0" w:after="0" w:line="322" w:lineRule="exact"/>
+              <w:ind w:left="0" w:firstLine="0"/>
+              <w:jc w:val="left"/>
             </w:pPr>
           </w:p>
         </w:tc>
       </w:tr>
       <w:tr>
         <w:trPr>
-          <w:trHeight w:val="392" w:hRule="exact"/>
+          <w:trHeight w:val="322" w:hRule="exact"/>
         </w:trPr>
         <w:tc>
           <w:tcPr>
@@ -241,10 +292,30 @@
           </w:tcPr>
           <w:p>
             <w:pPr>
-              <w:pStyle w:val="GANDCaption"/>
+              <w:spacing w:before="0" w:after="0" w:line="322" w:lineRule="exact"/>
+              <w:ind w:left="0" w:firstLine="0"/>
+              <w:jc w:val="left"/>
             </w:pPr>
             <w:r>
-              <w:t xml:space="preserve">GEORGE MARTINEZ, an individual,</w:t>
+              <w:t xml:space="preserve">GEORGE</w:t>
+            </w:r>
+            <w:r>
+              <w:t xml:space="preserve"> </w:t>
+            </w:r>
+            <w:r>
+              <w:t xml:space="preserve">MARTINEZ,</w:t>
+            </w:r>
+            <w:r>
+              <w:t xml:space="preserve"> </w:t>
+            </w:r>
+            <w:r>
+              <w:t xml:space="preserve">an</w:t>
+            </w:r>
+            <w:r>
+              <w:t xml:space="preserve"> </w:t>
+            </w:r>
+            <w:r>
+              <w:t xml:space="preserve">individual,</w:t>
             </w:r>
           </w:p>
         </w:tc>
@@ -254,7 +325,9 @@
           </w:tcPr>
           <w:p>
             <w:pPr>
-              <w:pStyle w:val="GANDCaption"/>
+              <w:spacing w:before="0" w:after="0" w:line="322" w:lineRule="exact"/>
+              <w:ind w:left="0" w:firstLine="0"/>
+              <w:jc w:val="left"/>
             </w:pPr>
             <w:r>
               <w:t xml:space="preserve">)</w:t>
@@ -264,18 +337,22 @@
         <w:tc>
           <w:tcPr>
             <w:tcW w:w="4248" w:type="dxa"/>
-            <w:vMerge/>
           </w:tcPr>
           <w:p>
             <w:pPr>
-              <w:pStyle w:val="GANDCaption"/>
+              <w:spacing w:before="0" w:after="0" w:line="322" w:lineRule="exact"/>
+              <w:ind w:left="0" w:firstLine="0"/>
+              <w:jc w:val="left"/>
             </w:pPr>
+            <w:r>
+              <w:t xml:space="preserve">JURY TRIAL DEMANDED</w:t>
+            </w:r>
           </w:p>
         </w:tc>
       </w:tr>
       <w:tr>
         <w:trPr>
-          <w:trHeight w:val="392" w:hRule="exact"/>
+          <w:trHeight w:val="322" w:hRule="exact"/>
         </w:trPr>
         <w:tc>
           <w:tcPr>
@@ -283,8 +360,9 @@
           </w:tcPr>
           <w:p>
             <w:pPr>
-              <w:pStyle w:val="GANDCaption"/>
-              <w:ind w:left="2160"/>
+              <w:spacing w:before="0" w:after="0" w:line="322" w:lineRule="exact"/>
+              <w:ind w:left="2160" w:firstLine="0"/>
+              <w:jc w:val="left"/>
             </w:pPr>
             <w:r>
               <w:t xml:space="preserve">Defendant.</w:t>
@@ -297,7 +375,9 @@
           </w:tcPr>
           <w:p>
             <w:pPr>
-              <w:pStyle w:val="GANDCaption"/>
+              <w:spacing w:before="0" w:after="0" w:line="322" w:lineRule="exact"/>
+              <w:ind w:left="0" w:firstLine="0"/>
+              <w:jc w:val="left"/>
             </w:pPr>
             <w:r>
               <w:t xml:space="preserve">)</w:t>
@@ -307,11 +387,12 @@
         <w:tc>
           <w:tcPr>
             <w:tcW w:w="4248" w:type="dxa"/>
-            <w:vMerge/>
           </w:tcPr>
           <w:p>
             <w:pPr>
-              <w:pStyle w:val="GANDCaption"/>
+              <w:spacing w:before="0" w:after="0" w:line="322" w:lineRule="exact"/>
+              <w:ind w:left="0" w:firstLine="0"/>
+              <w:jc w:val="left"/>
             </w:pPr>
           </w:p>
         </w:tc>
@@ -319,15 +400,21 @@
     </w:tbl>
     <w:p>
       <w:pPr>
-        <w:pStyle w:val="GANDCoverTitle"/>
-      </w:pPr>
-      <w:r>
-        <w:t xml:space="preserve">Complaint for Declaratory Judgment</w:t>
-      </w:r>
-    </w:p>
-    <w:p>
-      <w:pPr>
-        <w:pStyle w:val="FirstParagraph"/>
+        <w:spacing w:before="322" w:after="322" w:line="322" w:lineRule="exact"/>
+        <w:ind w:left="0" w:firstLine="0"/>
+        <w:jc w:val="center"/>
+      </w:pPr>
+      <w:r>
+        <w:rPr>
+          <w:b/>
+          <w:bCs/>
+        </w:rPr>
+        <w:t xml:space="preserve">COMPLAINT FOR DECLARATORY JUDGMENT</w:t>
+      </w:r>
+    </w:p>
+    <w:p>
+      <w:pPr>
+        <w:pStyle w:val="BodyText"/>
       </w:pPr>
       <w:r>
         <w:t xml:space="preserve">Plaintiff ServeCo North America LLC (“ServeCo”), for its Complaint against Defendant Gumersindo Martinez, also known as George Martinez (“Martinez”), alleges as follows:</w:t>
@@ -336,16 +423,65 @@
     <w:p>
       <w:pPr>
         <w:pStyle w:val="Heading1"/>
-      </w:pPr>
-      <w:bookmarkStart w:id="9" w:name="_f96794afb107ca6f5d98c4ff18adc0aee0ad0c3"/>
-      <w:r>
-        <w:t xml:space="preserve">Nature of the Action</w:t>
-      </w:r>
-      <w:bookmarkEnd w:id="9"/>
-    </w:p>
-    <w:p>
-      <w:pPr>
-        <w:pStyle w:val="GANDNumbered"/>
+        <w:keepNext/>
+        <w:keepLines/>
+        <w:spacing w:before="322" w:after="322" w:line="322" w:lineRule="exact"/>
+        <w:ind w:left="0" w:firstLine="0"/>
+        <w:jc w:val="center"/>
+      </w:pPr>
+      <w:r>
+        <w:rPr>
+          <w:b/>
+          <w:bCs/>
+        </w:rPr>
+        <w:t xml:space="preserve">NATURE</w:t>
+      </w:r>
+      <w:r>
+        <w:rPr>
+          <w:b/>
+          <w:bCs/>
+        </w:rPr>
+        <w:t xml:space="preserve"> </w:t>
+      </w:r>
+      <w:r>
+        <w:rPr>
+          <w:b/>
+          <w:bCs/>
+        </w:rPr>
+        <w:t xml:space="preserve">OF</w:t>
+      </w:r>
+      <w:r>
+        <w:rPr>
+          <w:b/>
+          <w:bCs/>
+        </w:rPr>
+        <w:t xml:space="preserve"> </w:t>
+      </w:r>
+      <w:r>
+        <w:rPr>
+          <w:b/>
+          <w:bCs/>
+        </w:rPr>
+        <w:t xml:space="preserve">THE</w:t>
+      </w:r>
+      <w:r>
+        <w:rPr>
+          <w:b/>
+          <w:bCs/>
+        </w:rPr>
+        <w:t xml:space="preserve"> </w:t>
+      </w:r>
+      <w:r>
+        <w:rPr>
+          <w:b/>
+          <w:bCs/>
+        </w:rPr>
+        <w:t xml:space="preserve">ACTION</w:t>
+      </w:r>
+    </w:p>
+    <w:p>
+      <w:pPr>
+        <w:pStyle w:val="BodyText"/>
       </w:pPr>
       <w:r>
         <w:t xml:space="preserve">1.</w:t>
@@ -354,12 +490,12 @@
         <w:tab/>
       </w:r>
       <w:r>
-        <w:t xml:space="preserve">This is a civil action for a declaratory judgment under the Declaratory Judgment Act, 28 U.S.C. §§ 2201 and 2202, and the Patent Laws of the United States, 35 U.S.C. § 1 et seq., that ServeCo does not infringe and is not liable for infringement of any claim of United States Patent No. 12,618,781 B2 (“the ’781 patent”), and that the claims of the ’781 patent are invalid.</w:t>
-      </w:r>
-    </w:p>
-    <w:p>
-      <w:pPr>
-        <w:pStyle w:val="GANDNumbered"/>
+        <w:t xml:space="preserve">This is a civil action for a declaratory judgment under the Declaratory Judgment Act, 28 U.S.C. §§ 2201 and 2202, and the Patent Laws of the United States, 35 U.S.C. § 1 et seq., that ServeCo does not infringe and is not liable for infringement of any claim of United States Patent No. 12,618,781 B2 (“the ’781 patent”), and that the claims of the ’781 patent are invalid.</w:t>
+      </w:r>
+    </w:p>
+    <w:p>
+      <w:pPr>
+        <w:pStyle w:val="BodyText"/>
       </w:pPr>
       <w:r>
         <w:t xml:space="preserve">2.</w:t>
@@ -373,7 +509,7 @@
     </w:p>
     <w:p>
       <w:pPr>
-        <w:pStyle w:val="GANDNumbered"/>
+        <w:pStyle w:val="BodyText"/>
       </w:pPr>
       <w:r>
         <w:t xml:space="preserve">3.</w:t>
@@ -387,7 +523,7 @@
     </w:p>
     <w:p>
       <w:pPr>
-        <w:pStyle w:val="GANDNumbered"/>
+        <w:pStyle w:val="BodyText"/>
       </w:pPr>
       <w:r>
         <w:t xml:space="preserve">4.</w:t>
@@ -401,7 +537,7 @@
     </w:p>
     <w:p>
       <w:pPr>
-        <w:pStyle w:val="GANDNumbered"/>
+        <w:pStyle w:val="BodyText"/>
       </w:pPr>
       <w:r>
         <w:t xml:space="preserve">5.</w:t>
@@ -415,7 +551,7 @@
     </w:p>
     <w:p>
       <w:pPr>
-        <w:pStyle w:val="GANDNumbered"/>
+        <w:pStyle w:val="BodyText"/>
       </w:pPr>
       <w:r>
         <w:t xml:space="preserve">6.</w:t>
@@ -429,7 +565,7 @@
     </w:p>
     <w:p>
       <w:pPr>
-        <w:pStyle w:val="GANDNumbered"/>
+        <w:pStyle w:val="BodyText"/>
       </w:pPr>
       <w:r>
         <w:t xml:space="preserve">7.</w:t>
@@ -444,16 +580,37 @@
     <w:p>
       <w:pPr>
         <w:pStyle w:val="Heading1"/>
-      </w:pPr>
-      <w:bookmarkStart w:id="10" w:name="_11f40d06de0edd3a9fc61e6e200a5b73fb8147e"/>
-      <w:r>
-        <w:t xml:space="preserve">The Parties</w:t>
-      </w:r>
-      <w:bookmarkEnd w:id="10"/>
-    </w:p>
-    <w:p>
-      <w:pPr>
-        <w:pStyle w:val="GANDNumbered"/>
+        <w:keepNext/>
+        <w:keepLines/>
+        <w:spacing w:before="322" w:after="322" w:line="322" w:lineRule="exact"/>
+        <w:ind w:left="0" w:firstLine="0"/>
+        <w:jc w:val="center"/>
+      </w:pPr>
+      <w:r>
+        <w:rPr>
+          <w:b/>
+          <w:bCs/>
+        </w:rPr>
+        <w:t xml:space="preserve">THE</w:t>
+      </w:r>
+      <w:r>
+        <w:rPr>
+          <w:b/>
+          <w:bCs/>
+        </w:rPr>
+        <w:t xml:space="preserve"> </w:t>
+      </w:r>
+      <w:r>
+        <w:rPr>
+          <w:b/>
+          <w:bCs/>
+        </w:rPr>
+        <w:t xml:space="preserve">PARTIES</w:t>
+      </w:r>
+    </w:p>
+    <w:p>
+      <w:pPr>
+        <w:pStyle w:val="BodyText"/>
       </w:pPr>
       <w:r>
         <w:t xml:space="preserve">8.</w:t>
@@ -467,7 +624,7 @@
     </w:p>
     <w:p>
       <w:pPr>
-        <w:pStyle w:val="GANDNumbered"/>
+        <w:pStyle w:val="BodyText"/>
       </w:pPr>
       <w:r>
         <w:t xml:space="preserve">9.</w:t>
@@ -481,7 +638,7 @@
     </w:p>
     <w:p>
       <w:pPr>
-        <w:pStyle w:val="GANDNumbered"/>
+        <w:pStyle w:val="BodyText"/>
       </w:pPr>
       <w:r>
         <w:t xml:space="preserve">10.</w:t>
@@ -490,22 +647,57 @@
         <w:tab/>
       </w:r>
       <w:r>
-        <w:t xml:space="preserve">Martinez is named as an inventor on the ’781 patent. Martinez purports to be the owner of all right, title, and interest in the ’781 patent. The ’781 patent also identifies Daniel Esteban Viviani, as a co-inventor. ServeCo reserves the right to amend this Complaint to add Mr. Viviani or any other person or entity holding an ownership interest in the ’781 patent as a party if discovery reveals that any such interests exist.</w:t>
+        <w:t xml:space="preserve">Martinez is named as an inventor on the ’781 patent. Martinez purports to be the owner of all right, title, and interest in the ’781 patent. The ’781 patent also identifies Daniel Esteban Viviani, as a co-inventor. ServeCo reserves the right to amend this Complaint to add Mr. Viviani or any other person or entity holding an ownership interest in the ’781 patent as a party if discovery reveals that any such interests exist.</w:t>
       </w:r>
     </w:p>
     <w:p>
       <w:pPr>
         <w:pStyle w:val="Heading1"/>
-      </w:pPr>
-      <w:bookmarkStart w:id="11" w:name="_0e2df9c0fe52ebd43073ce38f4076c822df9b17"/>
-      <w:r>
-        <w:t xml:space="preserve">Jurisdiction and Venue</w:t>
-      </w:r>
-      <w:bookmarkEnd w:id="11"/>
-    </w:p>
-    <w:p>
-      <w:pPr>
-        <w:pStyle w:val="GANDNumbered"/>
+        <w:keepNext/>
+        <w:keepLines/>
+        <w:spacing w:before="322" w:after="322" w:line="322" w:lineRule="exact"/>
+        <w:ind w:left="0" w:firstLine="0"/>
+        <w:jc w:val="center"/>
+      </w:pPr>
+      <w:r>
+        <w:rPr>
+          <w:b/>
+          <w:bCs/>
+        </w:rPr>
+        <w:t xml:space="preserve">JURISDICTION</w:t>
+      </w:r>
+      <w:r>
+        <w:rPr>
+          <w:b/>
+          <w:bCs/>
+        </w:rPr>
+        <w:t xml:space="preserve"> </w:t>
+      </w:r>
+      <w:r>
+        <w:rPr>
+          <w:b/>
+          <w:bCs/>
+        </w:rPr>
+        <w:t xml:space="preserve">AND</w:t>
+      </w:r>
+      <w:r>
+        <w:rPr>
+          <w:b/>
+          <w:bCs/>
+        </w:rPr>
+        <w:t xml:space="preserve"> </w:t>
+      </w:r>
+      <w:r>
+        <w:rPr>
+          <w:b/>
+          <w:bCs/>
+        </w:rPr>
+        <w:t xml:space="preserve">VENUE</w:t>
+      </w:r>
+    </w:p>
+    <w:p>
+      <w:pPr>
+        <w:pStyle w:val="BodyText"/>
       </w:pPr>
       <w:r>
         <w:t xml:space="preserve">11.</w:t>
@@ -514,12 +706,12 @@
         <w:tab/>
       </w:r>
       <w:r>
-        <w:t xml:space="preserve">This Court has subject matter jurisdiction over this action under 28 U.S.C. §§ 1331, 1338(a), 2201, and 2202, because this action arises under the Patent Laws of the United States and presents an actual controversy within this Court’s jurisdiction.</w:t>
-      </w:r>
-    </w:p>
-    <w:p>
-      <w:pPr>
-        <w:pStyle w:val="GANDNumbered"/>
+        <w:t xml:space="preserve">This Court has subject matter jurisdiction over this action under 28 U.S.C. §§ 1331, 1338(a), 2201, and 2202, because this action arises under the Patent Laws of the United States and presents an actual controversy within this Court’s jurisdiction.</w:t>
+      </w:r>
+    </w:p>
+    <w:p>
+      <w:pPr>
+        <w:pStyle w:val="BodyText"/>
       </w:pPr>
       <w:r>
         <w:t xml:space="preserve">12.</w:t>
@@ -533,7 +725,7 @@
     </w:p>
     <w:p>
       <w:pPr>
-        <w:pStyle w:val="GANDNumbered"/>
+        <w:pStyle w:val="BodyText"/>
       </w:pPr>
       <w:r>
         <w:t xml:space="preserve">13.</w:t>
@@ -542,12 +734,24 @@
         <w:tab/>
       </w:r>
       <w:r>
-        <w:t xml:space="preserve">This Court has personal jurisdiction over Martinez under the Georgia Long-Arm Statute, O.C.G.A. § 9-10-91, and consistent with due process.</w:t>
-      </w:r>
-    </w:p>
-    <w:p>
-      <w:pPr>
-        <w:pStyle w:val="GANDNumbered"/>
+        <w:t xml:space="preserve">This Court has personal jurisdiction over Martinez under the Georgia Long-Arm Statute, O.C.G.A. § 9</w:t>
+      </w:r>
+      <w:r>
+        <w:noBreakHyphen/>
+      </w:r>
+      <w:r>
+        <w:t xml:space="preserve">10</w:t>
+      </w:r>
+      <w:r>
+        <w:noBreakHyphen/>
+      </w:r>
+      <w:r>
+        <w:t xml:space="preserve">91, and consistent with due process.</w:t>
+      </w:r>
+    </w:p>
+    <w:p>
+      <w:pPr>
+        <w:pStyle w:val="BodyText"/>
       </w:pPr>
       <w:r>
         <w:t xml:space="preserve">14.</w:t>
@@ -561,7 +765,7 @@
     </w:p>
     <w:p>
       <w:pPr>
-        <w:pStyle w:val="GANDNumbered"/>
+        <w:pStyle w:val="BodyText"/>
       </w:pPr>
       <w:r>
         <w:t xml:space="preserve">15.</w:t>
@@ -575,7 +779,7 @@
     </w:p>
     <w:p>
       <w:pPr>
-        <w:pStyle w:val="GANDNumbered"/>
+        <w:pStyle w:val="BodyText"/>
       </w:pPr>
       <w:r>
         <w:t xml:space="preserve">16.</w:t>
@@ -584,16 +788,25 @@
         <w:tab/>
       </w:r>
       <w:r>
-        <w:t xml:space="preserve">The August 21 letter also stated: “[W]e reserve the right to proceed in accordance with O.C.G.A. § 9-11-65 to seek an injunction against you. You are on notice that we intend to proceed under that subsection to obtain an injunction to prevent your continued unauthorized use.” (emphasis in original). Although Martinez’s specific reference to Georgia law was meritless,</w:t>
-      </w:r>
-      <w:r>
-        <w:t xml:space="preserve"> </w:t>
+        <w:t xml:space="preserve">The August 21 letter also stated: “[W]e reserve the right to proceed in accordance with O.C.G.A. § 9</w:t>
+      </w:r>
+      <w:r>
+        <w:noBreakHyphen/>
+      </w:r>
+      <w:r>
+        <w:t xml:space="preserve">11</w:t>
+      </w:r>
+      <w:r>
+        <w:noBreakHyphen/>
+      </w:r>
+      <w:r>
+        <w:t xml:space="preserve">65 to seek an injunction against you. You are on notice that we intend to proceed under that subsection to obtain an injunction to prevent your continued unauthorized use.” (emphasis in original). Although Martinez’s specific reference to Georgia law was meritless,</w:t>
       </w:r>
       <w:r>
         <w:rPr>
           <w:rStyle w:val="FootnoteReference"/>
         </w:rPr>
-        <w:footnoteReference w:id="12"/>
+        <w:footnoteReference w:id="9"/>
       </w:r>
       <w:r>
         <w:t xml:space="preserve"> </w:t>
@@ -604,7 +817,7 @@
     </w:p>
     <w:p>
       <w:pPr>
-        <w:pStyle w:val="GANDNumbered"/>
+        <w:pStyle w:val="BodyText"/>
       </w:pPr>
       <w:r>
         <w:t xml:space="preserve">17.</w:t>
@@ -618,7 +831,7 @@
     </w:p>
     <w:p>
       <w:pPr>
-        <w:pStyle w:val="GANDNumbered"/>
+        <w:pStyle w:val="BodyText"/>
       </w:pPr>
       <w:r>
         <w:t xml:space="preserve">18.</w:t>
@@ -632,7 +845,7 @@
     </w:p>
     <w:p>
       <w:pPr>
-        <w:pStyle w:val="GANDNumbered"/>
+        <w:pStyle w:val="BodyText"/>
       </w:pPr>
       <w:r>
         <w:t xml:space="preserve">19.</w:t>
@@ -646,7 +859,7 @@
     </w:p>
     <w:p>
       <w:pPr>
-        <w:pStyle w:val="GANDNumbered"/>
+        <w:pStyle w:val="BodyText"/>
       </w:pPr>
       <w:r>
         <w:t xml:space="preserve">20.</w:t>
@@ -660,7 +873,7 @@
     </w:p>
     <w:p>
       <w:pPr>
-        <w:pStyle w:val="GANDNumbered"/>
+        <w:pStyle w:val="BodyText"/>
       </w:pPr>
       <w:r>
         <w:t xml:space="preserve">21.</w:t>
@@ -674,7 +887,7 @@
     </w:p>
     <w:p>
       <w:pPr>
-        <w:pStyle w:val="GANDNumbered"/>
+        <w:pStyle w:val="BodyText"/>
       </w:pPr>
       <w:r>
         <w:t xml:space="preserve">22.</w:t>
@@ -683,32 +896,116 @@
         <w:tab/>
       </w:r>
       <w:r>
-        <w:t xml:space="preserve">Venue is proper in this District under 28 U.S.C. § 1391(b)(2) because a substantial part of the events or omissions giving rise to these claims occurred in this District, including Martinez’s employment with ServeCo, the development of the Device, ServeCo’s use of the accused device, Martinez’s accusations of infringement directed into this District, and the injury to ServeCo’s business and customer relationships.</w:t>
+        <w:t xml:space="preserve">Venue is proper in this District under 28 U.S.C. § 1391(b)⁠(2) because a substantial part of the events or omissions giving rise to these claims occurred in this District, including Martinez’s employment with ServeCo, the development of the Device, ServeCo’s use of the accused device, Martinez’s accusations of infringement directed into this District, and the injury to ServeCo’s business and customer relationships.</w:t>
       </w:r>
     </w:p>
     <w:p>
       <w:pPr>
         <w:pStyle w:val="Heading1"/>
-      </w:pPr>
-      <w:bookmarkStart w:id="13" w:name="_b8e5b8837ccf89115edfee2c48cc11b996d00ec"/>
-      <w:r>
-        <w:t xml:space="preserve">Factual Background</w:t>
-      </w:r>
-      <w:bookmarkEnd w:id="13"/>
+        <w:keepNext/>
+        <w:keepLines/>
+        <w:spacing w:before="322" w:after="322" w:line="322" w:lineRule="exact"/>
+        <w:ind w:left="0" w:firstLine="0"/>
+        <w:jc w:val="center"/>
+      </w:pPr>
+      <w:r>
+        <w:rPr>
+          <w:b/>
+          <w:bCs/>
+        </w:rPr>
+        <w:t xml:space="preserve">FACTUAL</w:t>
+      </w:r>
+      <w:r>
+        <w:rPr>
+          <w:b/>
+          <w:bCs/>
+        </w:rPr>
+        <w:t xml:space="preserve"> </w:t>
+      </w:r>
+      <w:r>
+        <w:rPr>
+          <w:b/>
+          <w:bCs/>
+        </w:rPr>
+        <w:t xml:space="preserve">BACKGROUND</w:t>
+      </w:r>
     </w:p>
     <w:p>
       <w:pPr>
         <w:pStyle w:val="Heading3"/>
-      </w:pPr>
-      <w:bookmarkStart w:id="14" w:name="_48eed813bd7861aae7b2bf3e50f8928eddd743a"/>
-      <w:r>
-        <w:t xml:space="preserve">A. ServeCo and Its Business</w:t>
-      </w:r>
-      <w:bookmarkEnd w:id="14"/>
-    </w:p>
-    <w:p>
-      <w:pPr>
-        <w:pStyle w:val="GANDNumbered"/>
+        <w:keepNext/>
+        <w:keepLines/>
+        <w:spacing w:before="322" w:after="322" w:line="322" w:lineRule="exact"/>
+        <w:ind w:left="0" w:firstLine="0"/>
+        <w:jc w:val="left"/>
+      </w:pPr>
+      <w:r>
+        <w:rPr>
+          <w:b/>
+          <w:bCs/>
+        </w:rPr>
+        <w:t xml:space="preserve">A.</w:t>
+      </w:r>
+      <w:r>
+        <w:rPr>
+          <w:b/>
+          <w:bCs/>
+        </w:rPr>
+        <w:t xml:space="preserve"> </w:t>
+      </w:r>
+      <w:r>
+        <w:rPr>
+          <w:b/>
+          <w:bCs/>
+        </w:rPr>
+        <w:t xml:space="preserve">ServeCo</w:t>
+      </w:r>
+      <w:r>
+        <w:rPr>
+          <w:b/>
+          <w:bCs/>
+        </w:rPr>
+        <w:t xml:space="preserve"> </w:t>
+      </w:r>
+      <w:r>
+        <w:rPr>
+          <w:b/>
+          <w:bCs/>
+        </w:rPr>
+        <w:t xml:space="preserve">and</w:t>
+      </w:r>
+      <w:r>
+        <w:rPr>
+          <w:b/>
+          <w:bCs/>
+        </w:rPr>
+        <w:t xml:space="preserve"> </w:t>
+      </w:r>
+      <w:r>
+        <w:rPr>
+          <w:b/>
+          <w:bCs/>
+        </w:rPr>
+        <w:t xml:space="preserve">Its</w:t>
+      </w:r>
+      <w:r>
+        <w:rPr>
+          <w:b/>
+          <w:bCs/>
+        </w:rPr>
+        <w:t xml:space="preserve"> </w:t>
+      </w:r>
+      <w:r>
+        <w:rPr>
+          <w:b/>
+          <w:bCs/>
+        </w:rPr>
+        <w:t xml:space="preserve">Business</w:t>
+      </w:r>
+    </w:p>
+    <w:p>
+      <w:pPr>
+        <w:pStyle w:val="BodyText"/>
       </w:pPr>
       <w:r>
         <w:t xml:space="preserve">23.</w:t>
@@ -722,7 +1019,7 @@
     </w:p>
     <w:p>
       <w:pPr>
-        <w:pStyle w:val="GANDNumbered"/>
+        <w:pStyle w:val="BodyText"/>
       </w:pPr>
       <w:r>
         <w:t xml:space="preserve">24.</w:t>
@@ -736,7 +1033,7 @@
     </w:p>
     <w:p>
       <w:pPr>
-        <w:pStyle w:val="GANDNumbered"/>
+        <w:pStyle w:val="BodyText"/>
       </w:pPr>
       <w:r>
         <w:t xml:space="preserve">25.</w:t>
@@ -745,22 +1042,155 @@
         <w:tab/>
       </w:r>
       <w:r>
-        <w:t xml:space="preserve">ServeCo and others in the industry have performed such measurements using methods that have been well known for many years. Known methods for measuring the depth of a mattress surface depression include using a taut string stretched across the top surface of a mattress and using a rigid straight edge laid across the top surface of the mattress. Mr. Martinez acknowledged these methods as prior art by describing them in the ’781 patent.</w:t>
+        <w:t xml:space="preserve">ServeCo and others in the industry have performed such measurements using methods that have been well known for many years. Known methods for measuring the depth of a mattress surface depression include using a taut string stretched across the top surface of a mattress and using a rigid straight edge laid across the top surface of the mattress. Mr. Martinez acknowledged these methods as prior art by describing them in the ’781 patent.</w:t>
       </w:r>
     </w:p>
     <w:p>
       <w:pPr>
         <w:pStyle w:val="Heading3"/>
-      </w:pPr>
-      <w:bookmarkStart w:id="15" w:name="_5e72bd5605ace1d2c92d9cfe30ac6d5fd654738"/>
-      <w:r>
-        <w:t xml:space="preserve">B. Martinez’s Employment at ServeCo and Development of the Device</w:t>
-      </w:r>
-      <w:bookmarkEnd w:id="15"/>
-    </w:p>
-    <w:p>
-      <w:pPr>
-        <w:pStyle w:val="GANDNumbered"/>
+        <w:keepNext/>
+        <w:keepLines/>
+        <w:spacing w:before="322" w:after="322" w:line="322" w:lineRule="exact"/>
+        <w:ind w:left="0" w:firstLine="0"/>
+        <w:jc w:val="left"/>
+      </w:pPr>
+      <w:r>
+        <w:rPr>
+          <w:b/>
+          <w:bCs/>
+        </w:rPr>
+        <w:t xml:space="preserve">B.</w:t>
+      </w:r>
+      <w:r>
+        <w:rPr>
+          <w:b/>
+          <w:bCs/>
+        </w:rPr>
+        <w:t xml:space="preserve"> </w:t>
+      </w:r>
+      <w:r>
+        <w:rPr>
+          <w:b/>
+          <w:bCs/>
+        </w:rPr>
+        <w:t xml:space="preserve">Martinez’s</w:t>
+      </w:r>
+      <w:r>
+        <w:rPr>
+          <w:b/>
+          <w:bCs/>
+        </w:rPr>
+        <w:t xml:space="preserve"> </w:t>
+      </w:r>
+      <w:r>
+        <w:rPr>
+          <w:b/>
+          <w:bCs/>
+        </w:rPr>
+        <w:t xml:space="preserve">Employment</w:t>
+      </w:r>
+      <w:r>
+        <w:rPr>
+          <w:b/>
+          <w:bCs/>
+        </w:rPr>
+        <w:t xml:space="preserve"> </w:t>
+      </w:r>
+      <w:r>
+        <w:rPr>
+          <w:b/>
+          <w:bCs/>
+        </w:rPr>
+        <w:t xml:space="preserve">at</w:t>
+      </w:r>
+      <w:r>
+        <w:rPr>
+          <w:b/>
+          <w:bCs/>
+        </w:rPr>
+        <w:t xml:space="preserve"> </w:t>
+      </w:r>
+      <w:r>
+        <w:rPr>
+          <w:b/>
+          <w:bCs/>
+        </w:rPr>
+        <w:t xml:space="preserve">ServeCo</w:t>
+      </w:r>
+      <w:r>
+        <w:rPr>
+          <w:b/>
+          <w:bCs/>
+        </w:rPr>
+        <w:t xml:space="preserve"> </w:t>
+      </w:r>
+      <w:r>
+        <w:rPr>
+          <w:b/>
+          <w:bCs/>
+        </w:rPr>
+        <w:t xml:space="preserve">and</w:t>
+      </w:r>
+      <w:r>
+        <w:rPr>
+          <w:b/>
+          <w:bCs/>
+        </w:rPr>
+        <w:t xml:space="preserve"> </w:t>
+      </w:r>
+      <w:r>
+        <w:rPr>
+          <w:b/>
+          <w:bCs/>
+        </w:rPr>
+        <w:t xml:space="preserve">Development</w:t>
+      </w:r>
+      <w:r>
+        <w:rPr>
+          <w:b/>
+          <w:bCs/>
+        </w:rPr>
+        <w:t xml:space="preserve"> </w:t>
+      </w:r>
+      <w:r>
+        <w:rPr>
+          <w:b/>
+          <w:bCs/>
+        </w:rPr>
+        <w:t xml:space="preserve">of</w:t>
+      </w:r>
+      <w:r>
+        <w:rPr>
+          <w:b/>
+          <w:bCs/>
+        </w:rPr>
+        <w:t xml:space="preserve"> </w:t>
+      </w:r>
+      <w:r>
+        <w:rPr>
+          <w:b/>
+          <w:bCs/>
+        </w:rPr>
+        <w:t xml:space="preserve">the</w:t>
+      </w:r>
+      <w:r>
+        <w:rPr>
+          <w:b/>
+          <w:bCs/>
+        </w:rPr>
+        <w:t xml:space="preserve"> </w:t>
+      </w:r>
+      <w:r>
+        <w:rPr>
+          <w:b/>
+          <w:bCs/>
+        </w:rPr>
+        <w:t xml:space="preserve">Device</w:t>
+      </w:r>
+    </w:p>
+    <w:p>
+      <w:pPr>
+        <w:pStyle w:val="BodyText"/>
       </w:pPr>
       <w:r>
         <w:t xml:space="preserve">26.</w:t>
@@ -769,12 +1199,12 @@
         <w:tab/>
       </w:r>
       <w:r>
-        <w:t xml:space="preserve">Martinez was employed by ServeCo from January 1, 2025 through August 26, 2026, in the position of President of Premier Furniture Consultant, LLC d/b/a ServeCo Repair. During this employment, Martinez reported to Anthony Milano, ServeCo’s Chief Executive Officer.</w:t>
-      </w:r>
-    </w:p>
-    <w:p>
-      <w:pPr>
-        <w:pStyle w:val="GANDNumbered"/>
+        <w:t xml:space="preserve">Martinez was employed by ServeCo from January 1, 2025 through August 26, 2026, in the position of President of Premier Furniture Consultant, LLC d/​b/​a ServeCo Repair. During this employment, Martinez reported to Anthony Milano, ServeCo’s Chief Executive Officer.</w:t>
+      </w:r>
+    </w:p>
+    <w:p>
+      <w:pPr>
+        <w:pStyle w:val="BodyText"/>
       </w:pPr>
       <w:r>
         <w:t xml:space="preserve">27.</w:t>
@@ -788,7 +1218,7 @@
     </w:p>
     <w:p>
       <w:pPr>
-        <w:pStyle w:val="GANDNumbered"/>
+        <w:pStyle w:val="BodyText"/>
       </w:pPr>
       <w:r>
         <w:t xml:space="preserve">28.</w:t>
@@ -802,7 +1232,7 @@
     </w:p>
     <w:p>
       <w:pPr>
-        <w:pStyle w:val="GANDNumbered"/>
+        <w:pStyle w:val="BodyText"/>
       </w:pPr>
       <w:r>
         <w:t xml:space="preserve">29.</w:t>
@@ -816,7 +1246,7 @@
     </w:p>
     <w:p>
       <w:pPr>
-        <w:pStyle w:val="GANDNumbered"/>
+        <w:pStyle w:val="BodyText"/>
       </w:pPr>
       <w:r>
         <w:t xml:space="preserve">30.</w:t>
@@ -831,26 +1261,110 @@
     <w:p>
       <w:pPr>
         <w:pStyle w:val="Heading1"/>
-      </w:pPr>
-      <w:bookmarkStart w:id="16" w:name="_fa1f76e1cc09a3982ea973da34e2e15b75cc058"/>
-      <w:r>
-        <w:t xml:space="preserve">Count III</w:t>
-      </w:r>
-      <w:bookmarkEnd w:id="16"/>
+        <w:keepNext/>
+        <w:keepLines/>
+        <w:spacing w:before="322" w:after="322" w:line="322" w:lineRule="exact"/>
+        <w:ind w:left="0" w:firstLine="0"/>
+        <w:jc w:val="center"/>
+      </w:pPr>
+      <w:r>
+        <w:rPr>
+          <w:b/>
+          <w:bCs/>
+        </w:rPr>
+        <w:t xml:space="preserve">COUNT</w:t>
+      </w:r>
+      <w:r>
+        <w:rPr>
+          <w:b/>
+          <w:bCs/>
+        </w:rPr>
+        <w:t xml:space="preserve"> </w:t>
+      </w:r>
+      <w:r>
+        <w:rPr>
+          <w:b/>
+          <w:bCs/>
+        </w:rPr>
+        <w:t xml:space="preserve">III</w:t>
+      </w:r>
     </w:p>
     <w:p>
       <w:pPr>
         <w:pStyle w:val="Heading2"/>
-      </w:pPr>
-      <w:bookmarkStart w:id="17" w:name="_57629c4f28437f935fff75ed817efd505288674"/>
-      <w:r>
-        <w:t xml:space="preserve">Declaratory Judgment of Implied License</w:t>
-      </w:r>
-      <w:bookmarkEnd w:id="17"/>
-    </w:p>
-    <w:p>
-      <w:pPr>
-        <w:pStyle w:val="GANDNumbered"/>
+        <w:keepNext/>
+        <w:keepLines/>
+        <w:spacing w:before="322" w:after="322" w:line="322" w:lineRule="exact"/>
+        <w:ind w:left="0" w:firstLine="0"/>
+        <w:jc w:val="center"/>
+      </w:pPr>
+      <w:r>
+        <w:rPr>
+          <w:b/>
+          <w:bCs/>
+        </w:rPr>
+        <w:t xml:space="preserve">Declaratory</w:t>
+      </w:r>
+      <w:r>
+        <w:rPr>
+          <w:b/>
+          <w:bCs/>
+        </w:rPr>
+        <w:t xml:space="preserve"> </w:t>
+      </w:r>
+      <w:r>
+        <w:rPr>
+          <w:b/>
+          <w:bCs/>
+        </w:rPr>
+        <w:t xml:space="preserve">Judgment</w:t>
+      </w:r>
+      <w:r>
+        <w:rPr>
+          <w:b/>
+          <w:bCs/>
+        </w:rPr>
+        <w:t xml:space="preserve"> </w:t>
+      </w:r>
+      <w:r>
+        <w:rPr>
+          <w:b/>
+          <w:bCs/>
+        </w:rPr>
+        <w:t xml:space="preserve">of</w:t>
+      </w:r>
+      <w:r>
+        <w:rPr>
+          <w:b/>
+          <w:bCs/>
+        </w:rPr>
+        <w:t xml:space="preserve"> </w:t>
+      </w:r>
+      <w:r>
+        <w:rPr>
+          <w:b/>
+          <w:bCs/>
+        </w:rPr>
+        <w:t xml:space="preserve">Implied</w:t>
+      </w:r>
+      <w:r>
+        <w:rPr>
+          <w:b/>
+          <w:bCs/>
+        </w:rPr>
+        <w:t xml:space="preserve"> </w:t>
+      </w:r>
+      <w:r>
+        <w:rPr>
+          <w:b/>
+          <w:bCs/>
+        </w:rPr>
+        <w:t xml:space="preserve">License</w:t>
+      </w:r>
+    </w:p>
+    <w:p>
+      <w:pPr>
+        <w:pStyle w:val="BodyText"/>
       </w:pPr>
       <w:r>
         <w:t xml:space="preserve">31.</w:t>
@@ -864,7 +1378,7 @@
     </w:p>
     <w:p>
       <w:pPr>
-        <w:pStyle w:val="GANDNumbered"/>
+        <w:pStyle w:val="BodyText"/>
       </w:pPr>
       <w:r>
         <w:t xml:space="preserve">32.</w:t>
@@ -878,7 +1392,7 @@
     </w:p>
     <w:p>
       <w:pPr>
-        <w:pStyle w:val="GANDNumbered"/>
+        <w:pStyle w:val="BodyText"/>
       </w:pPr>
       <w:r>
         <w:t xml:space="preserve">33.</w:t>
@@ -892,7 +1406,7 @@
     </w:p>
     <w:p>
       <w:pPr>
-        <w:pStyle w:val="GANDNumbered"/>
+        <w:pStyle w:val="BodyText"/>
       </w:pPr>
       <w:r>
         <w:t xml:space="preserve">34.</w:t>
@@ -906,7 +1420,7 @@
     </w:p>
     <w:p>
       <w:pPr>
-        <w:pStyle w:val="GANDNumbered"/>
+        <w:pStyle w:val="BodyText"/>
       </w:pPr>
       <w:r>
         <w:t xml:space="preserve">35.</w:t>
@@ -920,7 +1434,7 @@
     </w:p>
     <w:p>
       <w:pPr>
-        <w:pStyle w:val="GANDNumbered"/>
+        <w:pStyle w:val="BodyText"/>
       </w:pPr>
       <w:r>
         <w:t xml:space="preserve">36.</w:t>
@@ -934,7 +1448,7 @@
     </w:p>
     <w:p>
       <w:pPr>
-        <w:pStyle w:val="GANDNumbered"/>
+        <w:pStyle w:val="BodyText"/>
       </w:pPr>
       <w:r>
         <w:t xml:space="preserve">37.</w:t>
@@ -949,16 +1463,51 @@
     <w:p>
       <w:pPr>
         <w:pStyle w:val="Heading1"/>
-      </w:pPr>
-      <w:bookmarkStart w:id="18" w:name="_ef66b8fb8023651585f5d55fe5a420ee6f5e8cc"/>
-      <w:r>
-        <w:t xml:space="preserve">Prayer for Relief</w:t>
-      </w:r>
-      <w:bookmarkEnd w:id="18"/>
-    </w:p>
-    <w:p>
-      <w:pPr>
-        <w:pStyle w:val="FirstParagraph"/>
+        <w:keepNext/>
+        <w:keepLines/>
+        <w:spacing w:before="322" w:after="322" w:line="322" w:lineRule="exact"/>
+        <w:ind w:left="0" w:firstLine="0"/>
+        <w:jc w:val="center"/>
+      </w:pPr>
+      <w:r>
+        <w:rPr>
+          <w:b/>
+          <w:bCs/>
+        </w:rPr>
+        <w:t xml:space="preserve">PRAYER</w:t>
+      </w:r>
+      <w:r>
+        <w:rPr>
+          <w:b/>
+          <w:bCs/>
+        </w:rPr>
+        <w:t xml:space="preserve"> </w:t>
+      </w:r>
+      <w:r>
+        <w:rPr>
+          <w:b/>
+          <w:bCs/>
+        </w:rPr>
+        <w:t xml:space="preserve">FOR</w:t>
+      </w:r>
+      <w:r>
+        <w:rPr>
+          <w:b/>
+          <w:bCs/>
+        </w:rPr>
+        <w:t xml:space="preserve"> </w:t>
+      </w:r>
+      <w:r>
+        <w:rPr>
+          <w:b/>
+          <w:bCs/>
+        </w:rPr>
+        <w:t xml:space="preserve">RELIEF</w:t>
+      </w:r>
+    </w:p>
+    <w:p>
+      <w:pPr>
+        <w:pStyle w:val="BodyText"/>
       </w:pPr>
       <w:r>
         <w:t xml:space="preserve">WHEREFORE, Plaintiff ServeCo respectfully requests that this Court enter judgment in its favor and against Defendant Martinez as follows:</w:t>
@@ -966,7 +1515,12 @@
     </w:p>
     <w:p>
       <w:pPr>
-        <w:pStyle w:val="GANDLettered"/>
+        <w:tabs>
+          <w:tab w:val="left" w:pos="1440"/>
+        </w:tabs>
+        <w:spacing w:before="0" w:after="0" w:line="644" w:lineRule="exact"/>
+        <w:ind w:left="1440" w:hanging="720"/>
+        <w:jc w:val="left"/>
       </w:pPr>
       <w:r>
         <w:t xml:space="preserve">A.</w:t>
@@ -975,12 +1529,173 @@
         <w:tab/>
       </w:r>
       <w:r>
-        <w:t xml:space="preserve">Declaring that ServeCo has not infringed and does not infringe, directly or indirectly, literally or under the doctrine of equivalents, any claim of U.S. Patent No. 12,618,781;</w:t>
-      </w:r>
-    </w:p>
-    <w:p>
-      <w:pPr>
-        <w:pStyle w:val="GANDLettered"/>
+        <w:t xml:space="preserve">Declaring</w:t>
+      </w:r>
+      <w:r>
+        <w:t xml:space="preserve"> </w:t>
+      </w:r>
+      <w:r>
+        <w:t xml:space="preserve">that</w:t>
+      </w:r>
+      <w:r>
+        <w:t xml:space="preserve"> </w:t>
+      </w:r>
+      <w:r>
+        <w:t xml:space="preserve">ServeCo</w:t>
+      </w:r>
+      <w:r>
+        <w:t xml:space="preserve"> </w:t>
+      </w:r>
+      <w:r>
+        <w:t xml:space="preserve">has</w:t>
+      </w:r>
+      <w:r>
+        <w:t xml:space="preserve"> </w:t>
+      </w:r>
+      <w:r>
+        <w:t xml:space="preserve">not</w:t>
+      </w:r>
+      <w:r>
+        <w:t xml:space="preserve"> </w:t>
+      </w:r>
+      <w:r>
+        <w:t xml:space="preserve">infringed</w:t>
+      </w:r>
+      <w:r>
+        <w:t xml:space="preserve"> </w:t>
+      </w:r>
+      <w:r>
+        <w:t xml:space="preserve">and</w:t>
+      </w:r>
+      <w:r>
+        <w:t xml:space="preserve"> </w:t>
+      </w:r>
+      <w:r>
+        <w:t xml:space="preserve">does</w:t>
+      </w:r>
+      <w:r>
+        <w:t xml:space="preserve"> </w:t>
+      </w:r>
+      <w:r>
+        <w:t xml:space="preserve">not</w:t>
+      </w:r>
+      <w:r>
+        <w:t xml:space="preserve"> </w:t>
+      </w:r>
+      <w:r>
+        <w:t xml:space="preserve">infringe,</w:t>
+      </w:r>
+      <w:r>
+        <w:t xml:space="preserve"> </w:t>
+      </w:r>
+      <w:r>
+        <w:t xml:space="preserve">directly</w:t>
+      </w:r>
+      <w:r>
+        <w:t xml:space="preserve"> </w:t>
+      </w:r>
+      <w:r>
+        <w:t xml:space="preserve">or</w:t>
+      </w:r>
+      <w:r>
+        <w:t xml:space="preserve"> </w:t>
+      </w:r>
+      <w:r>
+        <w:t xml:space="preserve">indirectly,</w:t>
+      </w:r>
+      <w:r>
+        <w:t xml:space="preserve"> </w:t>
+      </w:r>
+      <w:r>
+        <w:t xml:space="preserve">literally</w:t>
+      </w:r>
+      <w:r>
+        <w:t xml:space="preserve"> </w:t>
+      </w:r>
+      <w:r>
+        <w:t xml:space="preserve">or</w:t>
+      </w:r>
+      <w:r>
+        <w:t xml:space="preserve"> </w:t>
+      </w:r>
+      <w:r>
+        <w:t xml:space="preserve">under</w:t>
+      </w:r>
+      <w:r>
+        <w:t xml:space="preserve"> </w:t>
+      </w:r>
+      <w:r>
+        <w:t xml:space="preserve">the</w:t>
+      </w:r>
+      <w:r>
+        <w:t xml:space="preserve"> </w:t>
+      </w:r>
+      <w:r>
+        <w:t xml:space="preserve">doctrine</w:t>
+      </w:r>
+      <w:r>
+        <w:t xml:space="preserve"> </w:t>
+      </w:r>
+      <w:r>
+        <w:t xml:space="preserve">of</w:t>
+      </w:r>
+      <w:r>
+        <w:t xml:space="preserve"> </w:t>
+      </w:r>
+      <w:r>
+        <w:t xml:space="preserve">equivalents,</w:t>
+      </w:r>
+      <w:r>
+        <w:t xml:space="preserve"> </w:t>
+      </w:r>
+      <w:r>
+        <w:t xml:space="preserve">any</w:t>
+      </w:r>
+      <w:r>
+        <w:t xml:space="preserve"> </w:t>
+      </w:r>
+      <w:r>
+        <w:t xml:space="preserve">claim</w:t>
+      </w:r>
+      <w:r>
+        <w:t xml:space="preserve"> </w:t>
+      </w:r>
+      <w:r>
+        <w:t xml:space="preserve">of</w:t>
+      </w:r>
+      <w:r>
+        <w:t xml:space="preserve"> </w:t>
+      </w:r>
+      <w:r>
+        <w:t xml:space="preserve">U.S.</w:t>
+      </w:r>
+      <w:r>
+        <w:t xml:space="preserve"> </w:t>
+      </w:r>
+      <w:r>
+        <w:t xml:space="preserve">Patent</w:t>
+      </w:r>
+      <w:r>
+        <w:t xml:space="preserve"> </w:t>
+      </w:r>
+      <w:r>
+        <w:t xml:space="preserve">No.</w:t>
+      </w:r>
+      <w:r>
+        <w:t xml:space="preserve"> </w:t>
+      </w:r>
+      <w:r>
+        <w:t xml:space="preserve">12,618,781;</w:t>
+      </w:r>
+    </w:p>
+    <w:p>
+      <w:pPr>
+        <w:tabs>
+          <w:tab w:val="left" w:pos="1440"/>
+        </w:tabs>
+        <w:spacing w:before="0" w:after="0" w:line="644" w:lineRule="exact"/>
+        <w:ind w:left="1440" w:hanging="720"/>
+        <w:jc w:val="left"/>
       </w:pPr>
       <w:r>
         <w:t xml:space="preserve">B.</w:t>
@@ -989,12 +1704,77 @@
         <w:tab/>
       </w:r>
       <w:r>
-        <w:t xml:space="preserve">Declaring that each claim of U.S. Patent No. 12,618,781 is invalid;</w:t>
-      </w:r>
-    </w:p>
-    <w:p>
-      <w:pPr>
-        <w:pStyle w:val="GANDLettered"/>
+        <w:t xml:space="preserve">Declaring</w:t>
+      </w:r>
+      <w:r>
+        <w:t xml:space="preserve"> </w:t>
+      </w:r>
+      <w:r>
+        <w:t xml:space="preserve">that</w:t>
+      </w:r>
+      <w:r>
+        <w:t xml:space="preserve"> </w:t>
+      </w:r>
+      <w:r>
+        <w:t xml:space="preserve">each</w:t>
+      </w:r>
+      <w:r>
+        <w:t xml:space="preserve"> </w:t>
+      </w:r>
+      <w:r>
+        <w:t xml:space="preserve">claim</w:t>
+      </w:r>
+      <w:r>
+        <w:t xml:space="preserve"> </w:t>
+      </w:r>
+      <w:r>
+        <w:t xml:space="preserve">of</w:t>
+      </w:r>
+      <w:r>
+        <w:t xml:space="preserve"> </w:t>
+      </w:r>
+      <w:r>
+        <w:t xml:space="preserve">U.S.</w:t>
+      </w:r>
+      <w:r>
+        <w:t xml:space="preserve"> </w:t>
+      </w:r>
+      <w:r>
+        <w:t xml:space="preserve">Patent</w:t>
+      </w:r>
+      <w:r>
+        <w:t xml:space="preserve"> </w:t>
+      </w:r>
+      <w:r>
+        <w:t xml:space="preserve">No.</w:t>
+      </w:r>
+      <w:r>
+        <w:t xml:space="preserve"> </w:t>
+      </w:r>
+      <w:r>
+        <w:t xml:space="preserve">12,618,781</w:t>
+      </w:r>
+      <w:r>
+        <w:t xml:space="preserve"> </w:t>
+      </w:r>
+      <w:r>
+        <w:t xml:space="preserve">is</w:t>
+      </w:r>
+      <w:r>
+        <w:t xml:space="preserve"> </w:t>
+      </w:r>
+      <w:r>
+        <w:t xml:space="preserve">invalid;</w:t>
+      </w:r>
+    </w:p>
+    <w:p>
+      <w:pPr>
+        <w:tabs>
+          <w:tab w:val="left" w:pos="1440"/>
+        </w:tabs>
+        <w:spacing w:before="0" w:after="0" w:line="644" w:lineRule="exact"/>
+        <w:ind w:left="1440" w:hanging="720"/>
+        <w:jc w:val="left"/>
       </w:pPr>
       <w:r>
         <w:t xml:space="preserve">C.</w:t>
@@ -1003,12 +1783,119 @@
         <w:tab/>
       </w:r>
       <w:r>
-        <w:t xml:space="preserve">Declaring that ServeCo holds an implied license to practice the subject matter claimed in U.S. Patent No. 12,618,781;</w:t>
-      </w:r>
-    </w:p>
-    <w:p>
-      <w:pPr>
-        <w:pStyle w:val="GANDLettered"/>
+        <w:t xml:space="preserve">Declaring</w:t>
+      </w:r>
+      <w:r>
+        <w:t xml:space="preserve"> </w:t>
+      </w:r>
+      <w:r>
+        <w:t xml:space="preserve">that</w:t>
+      </w:r>
+      <w:r>
+        <w:t xml:space="preserve"> </w:t>
+      </w:r>
+      <w:r>
+        <w:t xml:space="preserve">ServeCo</w:t>
+      </w:r>
+      <w:r>
+        <w:t xml:space="preserve"> </w:t>
+      </w:r>
+      <w:r>
+        <w:t xml:space="preserve">holds</w:t>
+      </w:r>
+      <w:r>
+        <w:t xml:space="preserve"> </w:t>
+      </w:r>
+      <w:r>
+        <w:t xml:space="preserve">an</w:t>
+      </w:r>
+      <w:r>
+        <w:t xml:space="preserve"> </w:t>
+      </w:r>
+      <w:r>
+        <w:t xml:space="preserve">implied</w:t>
+      </w:r>
+      <w:r>
+        <w:t xml:space="preserve"> </w:t>
+      </w:r>
+      <w:r>
+        <w:t xml:space="preserve">license</w:t>
+      </w:r>
+      <w:r>
+        <w:t xml:space="preserve"> </w:t>
+      </w:r>
+      <w:r>
+        <w:t xml:space="preserve">to</w:t>
+      </w:r>
+      <w:r>
+        <w:t xml:space="preserve"> </w:t>
+      </w:r>
+      <w:r>
+        <w:t xml:space="preserve">practice</w:t>
+      </w:r>
+      <w:r>
+        <w:t xml:space="preserve"> </w:t>
+      </w:r>
+      <w:r>
+        <w:t xml:space="preserve">the</w:t>
+      </w:r>
+      <w:r>
+        <w:t xml:space="preserve"> </w:t>
+      </w:r>
+      <w:r>
+        <w:t xml:space="preserve">subject</w:t>
+      </w:r>
+      <w:r>
+        <w:t xml:space="preserve"> </w:t>
+      </w:r>
+      <w:r>
+        <w:t xml:space="preserve">matter</w:t>
+      </w:r>
+      <w:r>
+        <w:t xml:space="preserve"> </w:t>
+      </w:r>
+      <w:r>
+        <w:t xml:space="preserve">claimed</w:t>
+      </w:r>
+      <w:r>
+        <w:t xml:space="preserve"> </w:t>
+      </w:r>
+      <w:r>
+        <w:t xml:space="preserve">in</w:t>
+      </w:r>
+      <w:r>
+        <w:t xml:space="preserve"> </w:t>
+      </w:r>
+      <w:r>
+        <w:t xml:space="preserve">U.S.</w:t>
+      </w:r>
+      <w:r>
+        <w:t xml:space="preserve"> </w:t>
+      </w:r>
+      <w:r>
+        <w:t xml:space="preserve">Patent</w:t>
+      </w:r>
+      <w:r>
+        <w:t xml:space="preserve"> </w:t>
+      </w:r>
+      <w:r>
+        <w:t xml:space="preserve">No.</w:t>
+      </w:r>
+      <w:r>
+        <w:t xml:space="preserve"> </w:t>
+      </w:r>
+      <w:r>
+        <w:t xml:space="preserve">12,618,781;</w:t>
+      </w:r>
+    </w:p>
+    <w:p>
+      <w:pPr>
+        <w:tabs>
+          <w:tab w:val="left" w:pos="1440"/>
+        </w:tabs>
+        <w:spacing w:before="0" w:after="0" w:line="644" w:lineRule="exact"/>
+        <w:ind w:left="1440" w:hanging="720"/>
+        <w:jc w:val="left"/>
       </w:pPr>
       <w:r>
         <w:t xml:space="preserve">D.</w:t>
@@ -1017,12 +1904,101 @@
         <w:tab/>
       </w:r>
       <w:r>
-        <w:t xml:space="preserve">Declaring that ServeCo is not liable to Martinez for infringement of U.S. Patent No. 12,618,781;</w:t>
-      </w:r>
-    </w:p>
-    <w:p>
-      <w:pPr>
-        <w:pStyle w:val="GANDLettered"/>
+        <w:t xml:space="preserve">Declaring</w:t>
+      </w:r>
+      <w:r>
+        <w:t xml:space="preserve"> </w:t>
+      </w:r>
+      <w:r>
+        <w:t xml:space="preserve">that</w:t>
+      </w:r>
+      <w:r>
+        <w:t xml:space="preserve"> </w:t>
+      </w:r>
+      <w:r>
+        <w:t xml:space="preserve">ServeCo</w:t>
+      </w:r>
+      <w:r>
+        <w:t xml:space="preserve"> </w:t>
+      </w:r>
+      <w:r>
+        <w:t xml:space="preserve">is</w:t>
+      </w:r>
+      <w:r>
+        <w:t xml:space="preserve"> </w:t>
+      </w:r>
+      <w:r>
+        <w:t xml:space="preserve">not</w:t>
+      </w:r>
+      <w:r>
+        <w:t xml:space="preserve"> </w:t>
+      </w:r>
+      <w:r>
+        <w:t xml:space="preserve">liable</w:t>
+      </w:r>
+      <w:r>
+        <w:t xml:space="preserve"> </w:t>
+      </w:r>
+      <w:r>
+        <w:t xml:space="preserve">to</w:t>
+      </w:r>
+      <w:r>
+        <w:t xml:space="preserve"> </w:t>
+      </w:r>
+      <w:r>
+        <w:t xml:space="preserve">Martinez</w:t>
+      </w:r>
+      <w:r>
+        <w:t xml:space="preserve"> </w:t>
+      </w:r>
+      <w:r>
+        <w:t xml:space="preserve">for</w:t>
+      </w:r>
+      <w:r>
+        <w:t xml:space="preserve"> </w:t>
+      </w:r>
+      <w:r>
+        <w:t xml:space="preserve">infringement</w:t>
+      </w:r>
+      <w:r>
+        <w:t xml:space="preserve"> </w:t>
+      </w:r>
+      <w:r>
+        <w:t xml:space="preserve">of</w:t>
+      </w:r>
+      <w:r>
+        <w:t xml:space="preserve"> </w:t>
+      </w:r>
+      <w:r>
+        <w:t xml:space="preserve">U.S.</w:t>
+      </w:r>
+      <w:r>
+        <w:t xml:space="preserve"> </w:t>
+      </w:r>
+      <w:r>
+        <w:t xml:space="preserve">Patent</w:t>
+      </w:r>
+      <w:r>
+        <w:t xml:space="preserve"> </w:t>
+      </w:r>
+      <w:r>
+        <w:t xml:space="preserve">No.</w:t>
+      </w:r>
+      <w:r>
+        <w:t xml:space="preserve"> </w:t>
+      </w:r>
+      <w:r>
+        <w:t xml:space="preserve">12,618,781;</w:t>
+      </w:r>
+    </w:p>
+    <w:p>
+      <w:pPr>
+        <w:tabs>
+          <w:tab w:val="left" w:pos="1440"/>
+        </w:tabs>
+        <w:spacing w:before="0" w:after="0" w:line="644" w:lineRule="exact"/>
+        <w:ind w:left="1440" w:hanging="720"/>
+        <w:jc w:val="left"/>
       </w:pPr>
       <w:r>
         <w:t xml:space="preserve">E.</w:t>
@@ -1031,12 +2007,227 @@
         <w:tab/>
       </w:r>
       <w:r>
-        <w:t xml:space="preserve">Permanently enjoining Martinez, and all persons acting in concert with him, from asserting or threatening to assert U.S. Patent No. 12,618,781 against ServeCo or against ServeCo’s customers, distributors, suppliers, or users on account of the Device;</w:t>
-      </w:r>
-    </w:p>
-    <w:p>
-      <w:pPr>
-        <w:pStyle w:val="GANDLettered"/>
+        <w:t xml:space="preserve">Permanently</w:t>
+      </w:r>
+      <w:r>
+        <w:t xml:space="preserve"> </w:t>
+      </w:r>
+      <w:r>
+        <w:t xml:space="preserve">enjoining</w:t>
+      </w:r>
+      <w:r>
+        <w:t xml:space="preserve"> </w:t>
+      </w:r>
+      <w:r>
+        <w:t xml:space="preserve">Martinez,</w:t>
+      </w:r>
+      <w:r>
+        <w:t xml:space="preserve"> </w:t>
+      </w:r>
+      <w:r>
+        <w:t xml:space="preserve">and</w:t>
+      </w:r>
+      <w:r>
+        <w:t xml:space="preserve"> </w:t>
+      </w:r>
+      <w:r>
+        <w:t xml:space="preserve">all</w:t>
+      </w:r>
+      <w:r>
+        <w:t xml:space="preserve"> </w:t>
+      </w:r>
+      <w:r>
+        <w:t xml:space="preserve">persons</w:t>
+      </w:r>
+      <w:r>
+        <w:t xml:space="preserve"> </w:t>
+      </w:r>
+      <w:r>
+        <w:t xml:space="preserve">acting</w:t>
+      </w:r>
+      <w:r>
+        <w:t xml:space="preserve"> </w:t>
+      </w:r>
+      <w:r>
+        <w:t xml:space="preserve">in</w:t>
+      </w:r>
+      <w:r>
+        <w:t xml:space="preserve"> </w:t>
+      </w:r>
+      <w:r>
+        <w:t xml:space="preserve">concert</w:t>
+      </w:r>
+      <w:r>
+        <w:t xml:space="preserve"> </w:t>
+      </w:r>
+      <w:r>
+        <w:t xml:space="preserve">with</w:t>
+      </w:r>
+      <w:r>
+        <w:t xml:space="preserve"> </w:t>
+      </w:r>
+      <w:r>
+        <w:t xml:space="preserve">him,</w:t>
+      </w:r>
+      <w:r>
+        <w:t xml:space="preserve"> </w:t>
+      </w:r>
+      <w:r>
+        <w:t xml:space="preserve">from</w:t>
+      </w:r>
+      <w:r>
+        <w:t xml:space="preserve"> </w:t>
+      </w:r>
+      <w:r>
+        <w:t xml:space="preserve">asserting</w:t>
+      </w:r>
+      <w:r>
+        <w:t xml:space="preserve"> </w:t>
+      </w:r>
+      <w:r>
+        <w:t xml:space="preserve">or</w:t>
+      </w:r>
+      <w:r>
+        <w:t xml:space="preserve"> </w:t>
+      </w:r>
+      <w:r>
+        <w:t xml:space="preserve">threatening</w:t>
+      </w:r>
+      <w:r>
+        <w:t xml:space="preserve"> </w:t>
+      </w:r>
+      <w:r>
+        <w:t xml:space="preserve">to</w:t>
+      </w:r>
+      <w:r>
+        <w:t xml:space="preserve"> </w:t>
+      </w:r>
+      <w:r>
+        <w:t xml:space="preserve">assert</w:t>
+      </w:r>
+      <w:r>
+        <w:t xml:space="preserve"> </w:t>
+      </w:r>
+      <w:r>
+        <w:t xml:space="preserve">U.S.</w:t>
+      </w:r>
+      <w:r>
+        <w:t xml:space="preserve"> </w:t>
+      </w:r>
+      <w:r>
+        <w:t xml:space="preserve">Patent</w:t>
+      </w:r>
+      <w:r>
+        <w:t xml:space="preserve"> </w:t>
+      </w:r>
+      <w:r>
+        <w:t xml:space="preserve">No.</w:t>
+      </w:r>
+      <w:r>
+        <w:t xml:space="preserve"> </w:t>
+      </w:r>
+      <w:r>
+        <w:t xml:space="preserve">12,618,781</w:t>
+      </w:r>
+      <w:r>
+        <w:t xml:space="preserve"> </w:t>
+      </w:r>
+      <w:r>
+        <w:t xml:space="preserve">against</w:t>
+      </w:r>
+      <w:r>
+        <w:t xml:space="preserve"> </w:t>
+      </w:r>
+      <w:r>
+        <w:t xml:space="preserve">ServeCo</w:t>
+      </w:r>
+      <w:r>
+        <w:t xml:space="preserve"> </w:t>
+      </w:r>
+      <w:r>
+        <w:t xml:space="preserve">or</w:t>
+      </w:r>
+      <w:r>
+        <w:t xml:space="preserve"> </w:t>
+      </w:r>
+      <w:r>
+        <w:t xml:space="preserve">against</w:t>
+      </w:r>
+      <w:r>
+        <w:t xml:space="preserve"> </w:t>
+      </w:r>
+      <w:r>
+        <w:t xml:space="preserve">ServeCo’s</w:t>
+      </w:r>
+      <w:r>
+        <w:t xml:space="preserve"> </w:t>
+      </w:r>
+      <w:r>
+        <w:t xml:space="preserve">customers,</w:t>
+      </w:r>
+      <w:r>
+        <w:t xml:space="preserve"> </w:t>
+      </w:r>
+      <w:r>
+        <w:t xml:space="preserve">distributors,</w:t>
+      </w:r>
+      <w:r>
+        <w:t xml:space="preserve"> </w:t>
+      </w:r>
+      <w:r>
+        <w:t xml:space="preserve">suppliers,</w:t>
+      </w:r>
+      <w:r>
+        <w:t xml:space="preserve"> </w:t>
+      </w:r>
+      <w:r>
+        <w:t xml:space="preserve">or</w:t>
+      </w:r>
+      <w:r>
+        <w:t xml:space="preserve"> </w:t>
+      </w:r>
+      <w:r>
+        <w:t xml:space="preserve">users</w:t>
+      </w:r>
+      <w:r>
+        <w:t xml:space="preserve"> </w:t>
+      </w:r>
+      <w:r>
+        <w:t xml:space="preserve">on</w:t>
+      </w:r>
+      <w:r>
+        <w:t xml:space="preserve"> </w:t>
+      </w:r>
+      <w:r>
+        <w:t xml:space="preserve">account</w:t>
+      </w:r>
+      <w:r>
+        <w:t xml:space="preserve"> </w:t>
+      </w:r>
+      <w:r>
+        <w:t xml:space="preserve">of</w:t>
+      </w:r>
+      <w:r>
+        <w:t xml:space="preserve"> </w:t>
+      </w:r>
+      <w:r>
+        <w:t xml:space="preserve">the</w:t>
+      </w:r>
+      <w:r>
+        <w:t xml:space="preserve"> </w:t>
+      </w:r>
+      <w:r>
+        <w:t xml:space="preserve">Device;</w:t>
+      </w:r>
+    </w:p>
+    <w:p>
+      <w:pPr>
+        <w:tabs>
+          <w:tab w:val="left" w:pos="1440"/>
+        </w:tabs>
+        <w:spacing w:before="0" w:after="0" w:line="644" w:lineRule="exact"/>
+        <w:ind w:left="1440" w:hanging="720"/>
+        <w:jc w:val="left"/>
       </w:pPr>
       <w:r>
         <w:t xml:space="preserve">F.</w:t>
@@ -1045,12 +2236,107 @@
         <w:tab/>
       </w:r>
       <w:r>
-        <w:t xml:space="preserve">Declaring this case exceptional under 35 U.S.C. § 285 and awarding ServeCo its reasonable attorneys’ fees;</w:t>
-      </w:r>
-    </w:p>
-    <w:p>
-      <w:pPr>
-        <w:pStyle w:val="GANDLettered"/>
+        <w:t xml:space="preserve">Declaring</w:t>
+      </w:r>
+      <w:r>
+        <w:t xml:space="preserve"> </w:t>
+      </w:r>
+      <w:r>
+        <w:t xml:space="preserve">this</w:t>
+      </w:r>
+      <w:r>
+        <w:t xml:space="preserve"> </w:t>
+      </w:r>
+      <w:r>
+        <w:t xml:space="preserve">case</w:t>
+      </w:r>
+      <w:r>
+        <w:t xml:space="preserve"> </w:t>
+      </w:r>
+      <w:r>
+        <w:t xml:space="preserve">exceptional</w:t>
+      </w:r>
+      <w:r>
+        <w:t xml:space="preserve"> </w:t>
+      </w:r>
+      <w:r>
+        <w:t xml:space="preserve">under</w:t>
+      </w:r>
+      <w:r>
+        <w:t xml:space="preserve"> </w:t>
+      </w:r>
+      <w:r>
+        <w:t xml:space="preserve">35</w:t>
+      </w:r>
+      <w:r>
+        <w:t xml:space="preserve"> </w:t>
+      </w:r>
+      <w:r>
+        <w:t xml:space="preserve">U.S.C.</w:t>
+      </w:r>
+      <w:r>
+        <w:t xml:space="preserve"> </w:t>
+      </w:r>
+      <w:r>
+        <w:t xml:space="preserve">§</w:t>
+      </w:r>
+      <w:r>
+        <w:t xml:space="preserve"> </w:t>
+      </w:r>
+      <w:r>
+        <w:t xml:space="preserve">285</w:t>
+      </w:r>
+      <w:r>
+        <w:t xml:space="preserve"> </w:t>
+      </w:r>
+      <w:r>
+        <w:t xml:space="preserve">and</w:t>
+      </w:r>
+      <w:r>
+        <w:t xml:space="preserve"> </w:t>
+      </w:r>
+      <w:r>
+        <w:t xml:space="preserve">awarding</w:t>
+      </w:r>
+      <w:r>
+        <w:t xml:space="preserve"> </w:t>
+      </w:r>
+      <w:r>
+        <w:t xml:space="preserve">ServeCo</w:t>
+      </w:r>
+      <w:r>
+        <w:t xml:space="preserve"> </w:t>
+      </w:r>
+      <w:r>
+        <w:t xml:space="preserve">its</w:t>
+      </w:r>
+      <w:r>
+        <w:t xml:space="preserve"> </w:t>
+      </w:r>
+      <w:r>
+        <w:t xml:space="preserve">reasonable</w:t>
+      </w:r>
+      <w:r>
+        <w:t xml:space="preserve"> </w:t>
+      </w:r>
+      <w:r>
+        <w:t xml:space="preserve">attorneys’</w:t>
+      </w:r>
+      <w:r>
+        <w:t xml:space="preserve"> </w:t>
+      </w:r>
+      <w:r>
+        <w:t xml:space="preserve">fees;</w:t>
+      </w:r>
+    </w:p>
+    <w:p>
+      <w:pPr>
+        <w:tabs>
+          <w:tab w:val="left" w:pos="1440"/>
+        </w:tabs>
+        <w:spacing w:before="0" w:after="0" w:line="644" w:lineRule="exact"/>
+        <w:ind w:left="1440" w:hanging="720"/>
+        <w:jc w:val="left"/>
       </w:pPr>
       <w:r>
         <w:t xml:space="preserve">G.</w:t>
@@ -1059,12 +2345,47 @@
         <w:tab/>
       </w:r>
       <w:r>
-        <w:t xml:space="preserve">Awarding ServeCo its costs of suit;</w:t>
-      </w:r>
-    </w:p>
-    <w:p>
-      <w:pPr>
-        <w:pStyle w:val="GANDLettered"/>
+        <w:t xml:space="preserve">Awarding</w:t>
+      </w:r>
+      <w:r>
+        <w:t xml:space="preserve"> </w:t>
+      </w:r>
+      <w:r>
+        <w:t xml:space="preserve">ServeCo</w:t>
+      </w:r>
+      <w:r>
+        <w:t xml:space="preserve"> </w:t>
+      </w:r>
+      <w:r>
+        <w:t xml:space="preserve">its</w:t>
+      </w:r>
+      <w:r>
+        <w:t xml:space="preserve"> </w:t>
+      </w:r>
+      <w:r>
+        <w:t xml:space="preserve">costs</w:t>
+      </w:r>
+      <w:r>
+        <w:t xml:space="preserve"> </w:t>
+      </w:r>
+      <w:r>
+        <w:t xml:space="preserve">of</w:t>
+      </w:r>
+      <w:r>
+        <w:t xml:space="preserve"> </w:t>
+      </w:r>
+      <w:r>
+        <w:t xml:space="preserve">suit;</w:t>
+      </w:r>
+    </w:p>
+    <w:p>
+      <w:pPr>
+        <w:tabs>
+          <w:tab w:val="left" w:pos="1440"/>
+        </w:tabs>
+        <w:spacing w:before="0" w:after="0" w:line="644" w:lineRule="exact"/>
+        <w:ind w:left="1440" w:hanging="720"/>
+        <w:jc w:val="left"/>
       </w:pPr>
       <w:r>
         <w:t xml:space="preserve">H.</w:t>
@@ -1073,12 +2394,95 @@
         <w:tab/>
       </w:r>
       <w:r>
-        <w:t xml:space="preserve">Awarding such other and further relief as this Court deems just and proper; and</w:t>
-      </w:r>
-    </w:p>
-    <w:p>
-      <w:pPr>
-        <w:pStyle w:val="GANDLettered"/>
+        <w:t xml:space="preserve">Awarding</w:t>
+      </w:r>
+      <w:r>
+        <w:t xml:space="preserve"> </w:t>
+      </w:r>
+      <w:r>
+        <w:t xml:space="preserve">such</w:t>
+      </w:r>
+      <w:r>
+        <w:t xml:space="preserve"> </w:t>
+      </w:r>
+      <w:r>
+        <w:t xml:space="preserve">other</w:t>
+      </w:r>
+      <w:r>
+        <w:t xml:space="preserve"> </w:t>
+      </w:r>
+      <w:r>
+        <w:t xml:space="preserve">and</w:t>
+      </w:r>
+      <w:r>
+        <w:t xml:space="preserve"> </w:t>
+      </w:r>
+      <w:r>
+        <w:t xml:space="preserve">further</w:t>
+      </w:r>
+      <w:r>
+        <w:t xml:space="preserve"> </w:t>
+      </w:r>
+      <w:r>
+        <w:t xml:space="preserve">relief</w:t>
+      </w:r>
+      <w:r>
+        <w:t xml:space="preserve"> </w:t>
+      </w:r>
+      <w:r>
+        <w:t xml:space="preserve">as</w:t>
+      </w:r>
+      <w:r>
+        <w:t xml:space="preserve"> </w:t>
+      </w:r>
+      <w:r>
+        <w:t xml:space="preserve">this</w:t>
+      </w:r>
+      <w:r>
+        <w:t xml:space="preserve"> </w:t>
+      </w:r>
+      <w:r>
+        <w:t xml:space="preserve">Court</w:t>
+      </w:r>
+      <w:r>
+        <w:t xml:space="preserve"> </w:t>
+      </w:r>
+      <w:r>
+        <w:t xml:space="preserve">deems</w:t>
+      </w:r>
+      <w:r>
+        <w:t xml:space="preserve"> </w:t>
+      </w:r>
+      <w:r>
+        <w:t xml:space="preserve">just</w:t>
+      </w:r>
+      <w:r>
+        <w:t xml:space="preserve"> </w:t>
+      </w:r>
+      <w:r>
+        <w:t xml:space="preserve">and</w:t>
+      </w:r>
+      <w:r>
+        <w:t xml:space="preserve"> </w:t>
+      </w:r>
+      <w:r>
+        <w:t xml:space="preserve">proper;</w:t>
+      </w:r>
+      <w:r>
+        <w:t xml:space="preserve"> </w:t>
+      </w:r>
+      <w:r>
+        <w:t xml:space="preserve">and</w:t>
+      </w:r>
+    </w:p>
+    <w:p>
+      <w:pPr>
+        <w:tabs>
+          <w:tab w:val="left" w:pos="1440"/>
+        </w:tabs>
+        <w:spacing w:before="0" w:after="0" w:line="644" w:lineRule="exact"/>
+        <w:ind w:left="1440" w:hanging="720"/>
+        <w:jc w:val="left"/>
       </w:pPr>
       <w:r>
         <w:t xml:space="preserve">I.</w:t>
@@ -1087,22 +2491,419 @@
         <w:tab/>
       </w:r>
       <w:r>
-        <w:t xml:space="preserve">Declaring that Martinez is equitably estopped from enforcing U.S. Patent No. 12,618,781 against ServeCo’s manufacture and use of the Device in the mattress-inspection activities described in the equitable-estoppel count, including their materially unchanged continuation within the scope established by Martinez’s conduct and ServeCo’s reliance, and that ServeCo is not liable to Martinez for patent infringement based on those activities.</w:t>
+        <w:t xml:space="preserve">Declaring</w:t>
+      </w:r>
+      <w:r>
+        <w:t xml:space="preserve"> </w:t>
+      </w:r>
+      <w:r>
+        <w:t xml:space="preserve">that</w:t>
+      </w:r>
+      <w:r>
+        <w:t xml:space="preserve"> </w:t>
+      </w:r>
+      <w:r>
+        <w:t xml:space="preserve">Martinez</w:t>
+      </w:r>
+      <w:r>
+        <w:t xml:space="preserve"> </w:t>
+      </w:r>
+      <w:r>
+        <w:t xml:space="preserve">is</w:t>
+      </w:r>
+      <w:r>
+        <w:t xml:space="preserve"> </w:t>
+      </w:r>
+      <w:r>
+        <w:t xml:space="preserve">equitably</w:t>
+      </w:r>
+      <w:r>
+        <w:t xml:space="preserve"> </w:t>
+      </w:r>
+      <w:r>
+        <w:t xml:space="preserve">estopped</w:t>
+      </w:r>
+      <w:r>
+        <w:t xml:space="preserve"> </w:t>
+      </w:r>
+      <w:r>
+        <w:t xml:space="preserve">from</w:t>
+      </w:r>
+      <w:r>
+        <w:t xml:space="preserve"> </w:t>
+      </w:r>
+      <w:r>
+        <w:t xml:space="preserve">enforcing</w:t>
+      </w:r>
+      <w:r>
+        <w:t xml:space="preserve"> </w:t>
+      </w:r>
+      <w:r>
+        <w:t xml:space="preserve">U.S.</w:t>
+      </w:r>
+      <w:r>
+        <w:t xml:space="preserve"> </w:t>
+      </w:r>
+      <w:r>
+        <w:t xml:space="preserve">Patent</w:t>
+      </w:r>
+      <w:r>
+        <w:t xml:space="preserve"> </w:t>
+      </w:r>
+      <w:r>
+        <w:t xml:space="preserve">No.</w:t>
+      </w:r>
+      <w:r>
+        <w:t xml:space="preserve"> </w:t>
+      </w:r>
+      <w:r>
+        <w:t xml:space="preserve">12,618,781</w:t>
+      </w:r>
+      <w:r>
+        <w:t xml:space="preserve"> </w:t>
+      </w:r>
+      <w:r>
+        <w:t xml:space="preserve">against</w:t>
+      </w:r>
+      <w:r>
+        <w:t xml:space="preserve"> </w:t>
+      </w:r>
+      <w:r>
+        <w:t xml:space="preserve">ServeCo’s</w:t>
+      </w:r>
+      <w:r>
+        <w:t xml:space="preserve"> </w:t>
+      </w:r>
+      <w:r>
+        <w:t xml:space="preserve">manufacture</w:t>
+      </w:r>
+      <w:r>
+        <w:t xml:space="preserve"> </w:t>
+      </w:r>
+      <w:r>
+        <w:t xml:space="preserve">and</w:t>
+      </w:r>
+      <w:r>
+        <w:t xml:space="preserve"> </w:t>
+      </w:r>
+      <w:r>
+        <w:t xml:space="preserve">use</w:t>
+      </w:r>
+      <w:r>
+        <w:t xml:space="preserve"> </w:t>
+      </w:r>
+      <w:r>
+        <w:t xml:space="preserve">of</w:t>
+      </w:r>
+      <w:r>
+        <w:t xml:space="preserve"> </w:t>
+      </w:r>
+      <w:r>
+        <w:t xml:space="preserve">the</w:t>
+      </w:r>
+      <w:r>
+        <w:t xml:space="preserve"> </w:t>
+      </w:r>
+      <w:r>
+        <w:t xml:space="preserve">Device</w:t>
+      </w:r>
+      <w:r>
+        <w:t xml:space="preserve"> </w:t>
+      </w:r>
+      <w:r>
+        <w:t xml:space="preserve">in</w:t>
+      </w:r>
+      <w:r>
+        <w:t xml:space="preserve"> </w:t>
+      </w:r>
+      <w:r>
+        <w:t xml:space="preserve">the</w:t>
+      </w:r>
+      <w:r>
+        <w:t xml:space="preserve"> </w:t>
+      </w:r>
+      <w:r>
+        <w:t xml:space="preserve">mattress-inspection</w:t>
+      </w:r>
+      <w:r>
+        <w:t xml:space="preserve"> </w:t>
+      </w:r>
+      <w:r>
+        <w:t xml:space="preserve">activities</w:t>
+      </w:r>
+      <w:r>
+        <w:t xml:space="preserve"> </w:t>
+      </w:r>
+      <w:r>
+        <w:t xml:space="preserve">described</w:t>
+      </w:r>
+      <w:r>
+        <w:t xml:space="preserve"> </w:t>
+      </w:r>
+      <w:r>
+        <w:t xml:space="preserve">in</w:t>
+      </w:r>
+      <w:r>
+        <w:t xml:space="preserve"> </w:t>
+      </w:r>
+      <w:r>
+        <w:t xml:space="preserve">the</w:t>
+      </w:r>
+      <w:r>
+        <w:t xml:space="preserve"> </w:t>
+      </w:r>
+      <w:r>
+        <w:t xml:space="preserve">equitable-estoppel</w:t>
+      </w:r>
+      <w:r>
+        <w:t xml:space="preserve"> </w:t>
+      </w:r>
+      <w:r>
+        <w:t xml:space="preserve">count,</w:t>
+      </w:r>
+      <w:r>
+        <w:t xml:space="preserve"> </w:t>
+      </w:r>
+      <w:r>
+        <w:t xml:space="preserve">including</w:t>
+      </w:r>
+      <w:r>
+        <w:t xml:space="preserve"> </w:t>
+      </w:r>
+      <w:r>
+        <w:t xml:space="preserve">their</w:t>
+      </w:r>
+      <w:r>
+        <w:t xml:space="preserve"> </w:t>
+      </w:r>
+      <w:r>
+        <w:t xml:space="preserve">materially</w:t>
+      </w:r>
+      <w:r>
+        <w:t xml:space="preserve"> </w:t>
+      </w:r>
+      <w:r>
+        <w:t xml:space="preserve">unchanged</w:t>
+      </w:r>
+      <w:r>
+        <w:t xml:space="preserve"> </w:t>
+      </w:r>
+      <w:r>
+        <w:t xml:space="preserve">continuation</w:t>
+      </w:r>
+      <w:r>
+        <w:t xml:space="preserve"> </w:t>
+      </w:r>
+      <w:r>
+        <w:t xml:space="preserve">within</w:t>
+      </w:r>
+      <w:r>
+        <w:t xml:space="preserve"> </w:t>
+      </w:r>
+      <w:r>
+        <w:t xml:space="preserve">the</w:t>
+      </w:r>
+      <w:r>
+        <w:t xml:space="preserve"> </w:t>
+      </w:r>
+      <w:r>
+        <w:t xml:space="preserve">scope</w:t>
+      </w:r>
+      <w:r>
+        <w:t xml:space="preserve"> </w:t>
+      </w:r>
+      <w:r>
+        <w:t xml:space="preserve">established</w:t>
+      </w:r>
+      <w:r>
+        <w:t xml:space="preserve"> </w:t>
+      </w:r>
+      <w:r>
+        <w:t xml:space="preserve">by</w:t>
+      </w:r>
+      <w:r>
+        <w:t xml:space="preserve"> </w:t>
+      </w:r>
+      <w:r>
+        <w:t xml:space="preserve">Martinez’s</w:t>
+      </w:r>
+      <w:r>
+        <w:t xml:space="preserve"> </w:t>
+      </w:r>
+      <w:r>
+        <w:t xml:space="preserve">conduct</w:t>
+      </w:r>
+      <w:r>
+        <w:t xml:space="preserve"> </w:t>
+      </w:r>
+      <w:r>
+        <w:t xml:space="preserve">and</w:t>
+      </w:r>
+      <w:r>
+        <w:t xml:space="preserve"> </w:t>
+      </w:r>
+      <w:r>
+        <w:t xml:space="preserve">ServeCo’s</w:t>
+      </w:r>
+      <w:r>
+        <w:t xml:space="preserve"> </w:t>
+      </w:r>
+      <w:r>
+        <w:t xml:space="preserve">reliance,</w:t>
+      </w:r>
+      <w:r>
+        <w:t xml:space="preserve"> </w:t>
+      </w:r>
+      <w:r>
+        <w:t xml:space="preserve">and</w:t>
+      </w:r>
+      <w:r>
+        <w:t xml:space="preserve"> </w:t>
+      </w:r>
+      <w:r>
+        <w:t xml:space="preserve">that</w:t>
+      </w:r>
+      <w:r>
+        <w:t xml:space="preserve"> </w:t>
+      </w:r>
+      <w:r>
+        <w:t xml:space="preserve">ServeCo</w:t>
+      </w:r>
+      <w:r>
+        <w:t xml:space="preserve"> </w:t>
+      </w:r>
+      <w:r>
+        <w:t xml:space="preserve">is</w:t>
+      </w:r>
+      <w:r>
+        <w:t xml:space="preserve"> </w:t>
+      </w:r>
+      <w:r>
+        <w:t xml:space="preserve">not</w:t>
+      </w:r>
+      <w:r>
+        <w:t xml:space="preserve"> </w:t>
+      </w:r>
+      <w:r>
+        <w:t xml:space="preserve">liable</w:t>
+      </w:r>
+      <w:r>
+        <w:t xml:space="preserve"> </w:t>
+      </w:r>
+      <w:r>
+        <w:t xml:space="preserve">to</w:t>
+      </w:r>
+      <w:r>
+        <w:t xml:space="preserve"> </w:t>
+      </w:r>
+      <w:r>
+        <w:t xml:space="preserve">Martinez</w:t>
+      </w:r>
+      <w:r>
+        <w:t xml:space="preserve"> </w:t>
+      </w:r>
+      <w:r>
+        <w:t xml:space="preserve">for</w:t>
+      </w:r>
+      <w:r>
+        <w:t xml:space="preserve"> </w:t>
+      </w:r>
+      <w:r>
+        <w:t xml:space="preserve">patent</w:t>
+      </w:r>
+      <w:r>
+        <w:t xml:space="preserve"> </w:t>
+      </w:r>
+      <w:r>
+        <w:t xml:space="preserve">infringement</w:t>
+      </w:r>
+      <w:r>
+        <w:t xml:space="preserve"> </w:t>
+      </w:r>
+      <w:r>
+        <w:t xml:space="preserve">based</w:t>
+      </w:r>
+      <w:r>
+        <w:t xml:space="preserve"> </w:t>
+      </w:r>
+      <w:r>
+        <w:t xml:space="preserve">on</w:t>
+      </w:r>
+      <w:r>
+        <w:t xml:space="preserve"> </w:t>
+      </w:r>
+      <w:r>
+        <w:t xml:space="preserve">those</w:t>
+      </w:r>
+      <w:r>
+        <w:t xml:space="preserve"> </w:t>
+      </w:r>
+      <w:r>
+        <w:t xml:space="preserve">activities.</w:t>
       </w:r>
     </w:p>
     <w:p>
       <w:pPr>
         <w:pStyle w:val="Heading1"/>
-      </w:pPr>
-      <w:bookmarkStart w:id="19" w:name="_ad1b4c81e85f39efecafd954037f97eddc8ed87"/>
-      <w:r>
-        <w:t xml:space="preserve">Demand for Jury Trial</w:t>
-      </w:r>
-      <w:bookmarkEnd w:id="19"/>
-    </w:p>
-    <w:p>
-      <w:pPr>
-        <w:pStyle w:val="FirstParagraph"/>
+        <w:keepNext/>
+        <w:keepLines/>
+        <w:spacing w:before="322" w:after="322" w:line="322" w:lineRule="exact"/>
+        <w:ind w:left="0" w:firstLine="0"/>
+        <w:jc w:val="center"/>
+      </w:pPr>
+      <w:r>
+        <w:rPr>
+          <w:b/>
+          <w:bCs/>
+        </w:rPr>
+        <w:t xml:space="preserve">DEMAND</w:t>
+      </w:r>
+      <w:r>
+        <w:rPr>
+          <w:b/>
+          <w:bCs/>
+        </w:rPr>
+        <w:t xml:space="preserve"> </w:t>
+      </w:r>
+      <w:r>
+        <w:rPr>
+          <w:b/>
+          <w:bCs/>
+        </w:rPr>
+        <w:t xml:space="preserve">FOR</w:t>
+      </w:r>
+      <w:r>
+        <w:rPr>
+          <w:b/>
+          <w:bCs/>
+        </w:rPr>
+        <w:t xml:space="preserve"> </w:t>
+      </w:r>
+      <w:r>
+        <w:rPr>
+          <w:b/>
+          <w:bCs/>
+        </w:rPr>
+        <w:t xml:space="preserve">JURY</w:t>
+      </w:r>
+      <w:r>
+        <w:rPr>
+          <w:b/>
+          <w:bCs/>
+        </w:rPr>
+        <w:t xml:space="preserve"> </w:t>
+      </w:r>
+      <w:r>
+        <w:rPr>
+          <w:b/>
+          <w:bCs/>
+        </w:rPr>
+        <w:t xml:space="preserve">TRIAL</w:t>
+      </w:r>
+    </w:p>
+    <w:p>
+      <w:pPr>
+        <w:pStyle w:val="BodyText"/>
       </w:pPr>
       <w:r>
         <w:t xml:space="preserve">Pursuant to Rule 38 of the Federal Rules of Civil Procedure, Plaintiff ServeCo North America LLC demands a trial by jury on all issues so triable.</w:t>
@@ -1110,7 +2911,11 @@
     </w:p>
     <w:p>
       <w:pPr>
-        <w:pStyle w:val="GANDSignatureLead"/>
+        <w:keepNext/>
+        <w:keepLines/>
+        <w:spacing w:before="644" w:after="0" w:line="322" w:lineRule="exact"/>
+        <w:ind w:left="0" w:firstLine="0"/>
+        <w:jc w:val="left"/>
       </w:pPr>
       <w:r>
         <w:t xml:space="preserve">Dated: October 6, 2026</w:t>
@@ -1118,7 +2923,11 @@
     </w:p>
     <w:p>
       <w:pPr>
-        <w:pStyle w:val="GANDSignatureBlockLead"/>
+        <w:keepNext/>
+        <w:keepLines/>
+        <w:spacing w:before="644" w:after="0" w:line="322" w:lineRule="exact"/>
+        <w:ind w:left="3888" w:firstLine="0"/>
+        <w:jc w:val="left"/>
       </w:pPr>
       <w:r>
         <w:t xml:space="preserve">/s/ Shane Nichols</w:t>
@@ -1126,7 +2935,11 @@
     </w:p>
     <w:p>
       <w:pPr>
-        <w:pStyle w:val="GANDSignatureBlock"/>
+        <w:keepNext/>
+        <w:keepLines/>
+        <w:spacing w:before="0" w:after="0" w:line="322" w:lineRule="exact"/>
+        <w:ind w:left="3888" w:firstLine="0"/>
+        <w:jc w:val="left"/>
       </w:pPr>
       <w:r>
         <w:t xml:space="preserve">A. Shane Nichols, Georgia Bar No. 542654</w:t>
@@ -1134,7 +2947,11 @@
     </w:p>
     <w:p>
       <w:pPr>
-        <w:pStyle w:val="GANDSignatureBlock"/>
+        <w:keepNext/>
+        <w:keepLines/>
+        <w:spacing w:before="0" w:after="0" w:line="322" w:lineRule="exact"/>
+        <w:ind w:left="3888" w:firstLine="0"/>
+        <w:jc w:val="left"/>
       </w:pPr>
       <w:r>
         <w:t xml:space="preserve">Warren J. Thomas, Georgia Bar No. 164714</w:t>
@@ -1142,7 +2959,11 @@
     </w:p>
     <w:p>
       <w:pPr>
-        <w:pStyle w:val="GANDSignatureBlock"/>
+        <w:keepNext/>
+        <w:keepLines/>
+        <w:spacing w:before="0" w:after="0" w:line="322" w:lineRule="exact"/>
+        <w:ind w:left="3888" w:firstLine="0"/>
+        <w:jc w:val="left"/>
       </w:pPr>
       <w:r>
         <w:t xml:space="preserve">Lee G. Hamilton, Georgia Bar No. 139644</w:t>
@@ -1150,39 +2971,129 @@
     </w:p>
     <w:p>
       <w:pPr>
-        <w:pStyle w:val="GANDSignatureGap"/>
-      </w:pPr>
-      <w:r>
-        <w:t xml:space="preserve">MEUNIER CARLIN &amp; CURFMAN LLC</w:t>
-      </w:r>
-    </w:p>
-    <w:p>
-      <w:pPr>
-        <w:pStyle w:val="GANDSignatureBlock"/>
-      </w:pPr>
-      <w:r>
-        <w:t xml:space="preserve">999 Peachtree Street NE, Suite 1300</w:t>
-      </w:r>
-    </w:p>
-    <w:p>
-      <w:pPr>
-        <w:pStyle w:val="GANDSignatureBlock"/>
-      </w:pPr>
-      <w:r>
-        <w:t xml:space="preserve">Atlanta, Georgia 30309</w:t>
-      </w:r>
-    </w:p>
-    <w:p>
-      <w:pPr>
-        <w:pStyle w:val="GANDSignatureBlock"/>
-      </w:pPr>
-      <w:r>
-        <w:t xml:space="preserve">Telephone: 404-645-7700</w:t>
-      </w:r>
-    </w:p>
-    <w:p>
-      <w:pPr>
-        <w:pStyle w:val="GANDSignatureBlock"/>
+        <w:keepNext/>
+        <w:keepLines/>
+        <w:spacing w:before="80" w:after="0" w:line="322" w:lineRule="exact"/>
+        <w:ind w:left="3888" w:firstLine="0"/>
+        <w:jc w:val="left"/>
+      </w:pPr>
+      <w:r>
+        <w:t xml:space="preserve">MEUNIER</w:t>
+      </w:r>
+      <w:r>
+        <w:t xml:space="preserve"> </w:t>
+      </w:r>
+      <w:r>
+        <w:t xml:space="preserve">CARLIN</w:t>
+      </w:r>
+      <w:r>
+        <w:t xml:space="preserve"> </w:t>
+      </w:r>
+      <w:r>
+        <w:t xml:space="preserve">&amp;</w:t>
+      </w:r>
+      <w:r>
+        <w:t xml:space="preserve"> </w:t>
+      </w:r>
+      <w:r>
+        <w:t xml:space="preserve">CURFMAN</w:t>
+      </w:r>
+      <w:r>
+        <w:t xml:space="preserve"> </w:t>
+      </w:r>
+      <w:r>
+        <w:t xml:space="preserve">LLC</w:t>
+      </w:r>
+    </w:p>
+    <w:p>
+      <w:pPr>
+        <w:keepNext/>
+        <w:keepLines/>
+        <w:spacing w:before="0" w:after="0" w:line="322" w:lineRule="exact"/>
+        <w:ind w:left="3888" w:firstLine="0"/>
+        <w:jc w:val="left"/>
+      </w:pPr>
+      <w:r>
+        <w:t xml:space="preserve">999</w:t>
+      </w:r>
+      <w:r>
+        <w:t xml:space="preserve"> </w:t>
+      </w:r>
+      <w:r>
+        <w:t xml:space="preserve">Peachtree</w:t>
+      </w:r>
+      <w:r>
+        <w:t xml:space="preserve"> </w:t>
+      </w:r>
+      <w:r>
+        <w:t xml:space="preserve">Street</w:t>
+      </w:r>
+      <w:r>
+        <w:t xml:space="preserve"> </w:t>
+      </w:r>
+      <w:r>
+        <w:t xml:space="preserve">NE,</w:t>
+      </w:r>
+      <w:r>
+        <w:t xml:space="preserve"> </w:t>
+      </w:r>
+      <w:r>
+        <w:t xml:space="preserve">Suite</w:t>
+      </w:r>
+      <w:r>
+        <w:t xml:space="preserve"> </w:t>
+      </w:r>
+      <w:r>
+        <w:t xml:space="preserve">1300</w:t>
+      </w:r>
+    </w:p>
+    <w:p>
+      <w:pPr>
+        <w:keepNext/>
+        <w:keepLines/>
+        <w:spacing w:before="0" w:after="0" w:line="322" w:lineRule="exact"/>
+        <w:ind w:left="3888" w:firstLine="0"/>
+        <w:jc w:val="left"/>
+      </w:pPr>
+      <w:r>
+        <w:t xml:space="preserve">Atlanta,</w:t>
+      </w:r>
+      <w:r>
+        <w:t xml:space="preserve"> </w:t>
+      </w:r>
+      <w:r>
+        <w:t xml:space="preserve">Georgia</w:t>
+      </w:r>
+      <w:r>
+        <w:t xml:space="preserve"> </w:t>
+      </w:r>
+      <w:r>
+        <w:t xml:space="preserve">30309</w:t>
+      </w:r>
+    </w:p>
+    <w:p>
+      <w:pPr>
+        <w:keepNext/>
+        <w:keepLines/>
+        <w:spacing w:before="0" w:after="0" w:line="322" w:lineRule="exact"/>
+        <w:ind w:left="3888" w:firstLine="0"/>
+        <w:jc w:val="left"/>
+      </w:pPr>
+      <w:r>
+        <w:t xml:space="preserve">Telephone: 404</w:t>
+        <w:noBreakHyphen/>
+        <w:t xml:space="preserve">645</w:t>
+        <w:noBreakHyphen/>
+        <w:t xml:space="preserve">7700</w:t>
+      </w:r>
+    </w:p>
+    <w:p>
+      <w:pPr>
+        <w:keepNext/>
+        <w:keepLines/>
+        <w:spacing w:before="0" w:after="0" w:line="322" w:lineRule="exact"/>
+        <w:ind w:left="3888" w:firstLine="0"/>
+        <w:jc w:val="left"/>
       </w:pPr>
       <w:r>
         <w:t xml:space="preserve">snichols@mcciplaw.com</w:t>
@@ -1190,7 +3101,11 @@
     </w:p>
     <w:p>
       <w:pPr>
-        <w:pStyle w:val="GANDSignatureBlock"/>
+        <w:keepNext/>
+        <w:keepLines/>
+        <w:spacing w:before="0" w:after="0" w:line="322" w:lineRule="exact"/>
+        <w:ind w:left="3888" w:firstLine="0"/>
+        <w:jc w:val="left"/>
       </w:pPr>
       <w:r>
         <w:t xml:space="preserve">wthomas@mcciplaw.com</w:t>
@@ -1198,7 +3113,11 @@
     </w:p>
     <w:p>
       <w:pPr>
-        <w:pStyle w:val="GANDSignatureBlock"/>
+        <w:keepNext/>
+        <w:keepLines/>
+        <w:spacing w:before="0" w:after="0" w:line="322" w:lineRule="exact"/>
+        <w:ind w:left="3888" w:firstLine="0"/>
+        <w:jc w:val="left"/>
       </w:pPr>
       <w:r>
         <w:t xml:space="preserve">lhamilton@mcciplaw.com</w:t>
@@ -1206,19 +3125,54 @@
     </w:p>
     <w:p>
       <w:pPr>
-        <w:pStyle w:val="GANDSignatureGap"/>
-      </w:pPr>
-      <w:r>
-        <w:t xml:space="preserve">Attorneys for Plaintiff ServeCo North America LLC</w:t>
+        <w:spacing w:before="80" w:after="0" w:line="322" w:lineRule="exact"/>
+        <w:ind w:left="3888" w:firstLine="0"/>
+        <w:jc w:val="left"/>
+      </w:pPr>
+      <w:r>
+        <w:t xml:space="preserve">Attorneys</w:t>
+      </w:r>
+      <w:r>
+        <w:t xml:space="preserve"> </w:t>
+      </w:r>
+      <w:r>
+        <w:t xml:space="preserve">for</w:t>
+      </w:r>
+      <w:r>
+        <w:t xml:space="preserve"> </w:t>
+      </w:r>
+      <w:r>
+        <w:t xml:space="preserve">Plaintiff</w:t>
+      </w:r>
+      <w:r>
+        <w:t xml:space="preserve"> </w:t>
+      </w:r>
+      <w:r>
+        <w:t xml:space="preserve">ServeCo</w:t>
+      </w:r>
+      <w:r>
+        <w:t xml:space="preserve"> </w:t>
+      </w:r>
+      <w:r>
+        <w:t xml:space="preserve">North</w:t>
+      </w:r>
+      <w:r>
+        <w:t xml:space="preserve"> </w:t>
+      </w:r>
+      <w:r>
+        <w:t xml:space="preserve">America</w:t>
+      </w:r>
+      <w:r>
+        <w:t xml:space="preserve"> </w:t>
+      </w:r>
+      <w:r>
+        <w:t xml:space="preserve">LLC</w:t>
       </w:r>
     </w:p>
     <w:sectPr>
-      <w:footerReference w:type="default" r:id="rIdGandFooter1"/>
-      <w:footnotePr>
-        <w:numRestart w:val="eachSect"/>
-      </w:footnotePr>
+      <w:footerReference w:type="default" r:id="rIdFooter1"/>
       <w:pgSz w:w="12240" w:h="15840"/>
-      <w:pgMar w:top="1440" w:right="1440" w:bottom="1440" w:left="1440" w:header="720" w:footer="720" w:gutter="0"/>
+      <w:pgMar w:top="1440" w:right="1440" w:bottom="1440" w:left="1440" w:header="720" w:footer="686" w:gutter="0"/>
     </w:sectPr>
   </w:body>
 </w:document>
@@ -1232,47 +3186,21 @@
 <w:ftr xmlns:w="http://schemas.openxmlformats.org/wordprocessingml/2006/main" xmlns:r="http://schemas.openxmlformats.org/officeDocument/2006/relationships">
   <w:p>
     <w:pPr>
-      <w:spacing w:before="0" w:after="0" w:line="240" w:lineRule="auto"/>
       <w:jc w:val="center"/>
     </w:pPr>
     <w:r>
-      <w:rPr>
-        <w:rFonts w:ascii="Times New Roman" w:hAnsi="Times New Roman" w:eastAsia="Times New Roman" w:cs="Times New Roman"/>
-        <w:sz w:val="28"/>
-        <w:szCs w:val="28"/>
-      </w:rPr>
       <w:fldChar w:fldCharType="begin"/>
     </w:r>
     <w:r>
-      <w:rPr>
-        <w:rFonts w:ascii="Times New Roman" w:hAnsi="Times New Roman" w:eastAsia="Times New Roman" w:cs="Times New Roman"/>
-        <w:sz w:val="28"/>
-        <w:szCs w:val="28"/>
-      </w:rPr>
       <w:instrText xml:space="preserve"> PAGE </w:instrText>
     </w:r>
     <w:r>
-      <w:rPr>
-        <w:rFonts w:ascii="Times New Roman" w:hAnsi="Times New Roman" w:eastAsia="Times New Roman" w:cs="Times New Roman"/>
-        <w:sz w:val="28"/>
-        <w:szCs w:val="28"/>
-      </w:rPr>
       <w:fldChar w:fldCharType="separate"/>
     </w:r>
     <w:r>
-      <w:rPr>
-        <w:rFonts w:ascii="Times New Roman" w:hAnsi="Times New Roman" w:eastAsia="Times New Roman" w:cs="Times New Roman"/>
-        <w:sz w:val="28"/>
-        <w:szCs w:val="28"/>
-      </w:rPr>
       <w:t>1</w:t>
     </w:r>
     <w:r>
-      <w:rPr>
-        <w:rFonts w:ascii="Times New Roman" w:hAnsi="Times New Roman" w:eastAsia="Times New Roman" w:cs="Times New Roman"/>
-        <w:sz w:val="28"/>
-        <w:szCs w:val="28"/>
-      </w:rPr>
       <w:fldChar w:fldCharType="end"/>
     </w:r>
   </w:p>
@@ -1295,7 +3223,7 @@
       </w:r>
     </w:p>
   </w:footnote>
-  <w:footnote w:id="12">
+  <w:footnote w:id="9">
     <w:p>
       <w:pPr>
         <w:pStyle w:val="FootnoteText"/>
@@ -1407,14 +3335,15 @@
     <w:rPrDefault>
       <w:rPr>
         <w:rFonts w:ascii="Times New Roman" w:hAnsi="Times New Roman" w:eastAsia="Times New Roman" w:cs="Times New Roman"/>
-        <w:sz w:val="24"/>
-        <w:szCs w:val="24"/>
+        <w:sz w:val="28"/>
+        <w:szCs w:val="28"/>
         <w:lang w:val="en-US" w:eastAsia="zh-CN" w:bidi="ar-SA"/>
       </w:rPr>
     </w:rPrDefault>
     <w:pPrDefault>
       <w:pPr>
-        <w:spacing w:after="200"/>
+        <w:widowControl/>
+        <w:spacing w:after="0"/>
       </w:pPr>
     </w:pPrDefault>
   </w:docDefaults>
@@ -1422,14 +3351,6 @@
   <w:style w:type="paragraph" w:default="1" w:styleId="Normal">
     <w:name w:val="Normal"/>
     <w:qFormat/>
-    <w:pPr>
-      <w:spacing w:before="0" w:after="0" w:line="240" w:lineRule="auto"/>
-    </w:pPr>
-    <w:rPr>
-      <w:rFonts w:ascii="Times New Roman" w:hAnsi="Times New Roman" w:eastAsia="Times New Roman" w:cs="Times New Roman"/>
-      <w:sz w:val="28"/>
-      <w:szCs w:val="28"/>
-    </w:rPr>
   </w:style>
   <w:style w:type="paragraph" w:styleId="BodyText">
     <w:name w:val="Body Text"/>
@@ -1440,39 +3361,20 @@
       <w:spacing w:before="0" w:after="0" w:line="644" w:lineRule="exact"/>
       <w:ind w:firstLine="720"/>
     </w:pPr>
-    <w:rPr>
-      <w:rFonts w:ascii="Times New Roman" w:hAnsi="Times New Roman" w:eastAsia="Times New Roman" w:cs="Times New Roman"/>
-      <w:sz w:val="28"/>
-      <w:szCs w:val="28"/>
-    </w:rPr>
   </w:style>
   <w:style w:type="paragraph" w:customStyle="1" w:styleId="FirstParagraph">
     <w:name w:val="First Paragraph"/>
     <w:basedOn w:val="BodyText"/>
     <w:next w:val="BodyText"/>
     <w:qFormat/>
-    <w:pPr>
-      <w:spacing w:before="0" w:after="0" w:line="644" w:lineRule="exact"/>
-      <w:ind w:firstLine="720"/>
-    </w:pPr>
-    <w:rPr>
-      <w:rFonts w:ascii="Times New Roman" w:hAnsi="Times New Roman" w:eastAsia="Times New Roman" w:cs="Times New Roman"/>
-      <w:sz w:val="28"/>
-      <w:szCs w:val="28"/>
-    </w:rPr>
   </w:style>
   <w:style w:type="paragraph" w:customStyle="1" w:styleId="Compact">
     <w:name w:val="Compact"/>
     <w:basedOn w:val="BodyText"/>
     <w:qFormat/>
     <w:pPr>
-      <w:spacing w:before="0" w:after="0" w:line="644" w:lineRule="exact"/>
+      <w:spacing w:before="36" w:after="36"/>
     </w:pPr>
-    <w:rPr>
-      <w:rFonts w:ascii="Times New Roman" w:hAnsi="Times New Roman" w:eastAsia="Times New Roman" w:cs="Times New Roman"/>
-      <w:sz w:val="28"/>
-      <w:szCs w:val="28"/>
-    </w:rPr>
   </w:style>
   <w:style w:type="paragraph" w:styleId="Title">
     <w:name w:val="Title"/>
@@ -1483,12 +3385,12 @@
     <w:qFormat/>
     <w:rsid w:val="00A10FD9"/>
     <w:pPr>
-      <w:spacing w:before="0" w:after="0" w:line="240" w:lineRule="auto"/>
+      <w:spacing w:after="80" w:line="240" w:lineRule="auto"/>
       <w:contextualSpacing/>
       <w:jc w:val="center"/>
     </w:pPr>
     <w:rPr>
-      <w:rFonts w:ascii="Times New Roman" w:hAnsi="Times New Roman" w:eastAsia="Times New Roman" w:cs="Times New Roman"/>
+      <w:rFonts w:asciiTheme="majorHAnsi" w:eastAsiaTheme="majorEastAsia" w:hAnsiTheme="majorHAnsi" w:cstheme="majorBidi"/>
       <w:sz w:val="56"/>
       <w:szCs w:val="56"/>
     </w:rPr>
@@ -1500,7 +3402,7 @@
     <w:uiPriority w:val="10"/>
     <w:rsid w:val="00A10FD9"/>
     <w:rPr>
-      <w:rFonts w:ascii="Times New Roman" w:hAnsi="Times New Roman" w:eastAsia="Times New Roman" w:cs="Times New Roman"/>
+      <w:rFonts w:asciiTheme="majorHAnsi" w:eastAsiaTheme="majorEastAsia" w:hAnsiTheme="majorHAnsi" w:cstheme="majorBidi"/>
       <w:sz w:val="56"/>
       <w:szCs w:val="56"/>
     </w:rPr>
@@ -1519,7 +3421,7 @@
       </w:numPr>
     </w:pPr>
     <w:rPr>
-      <w:rFonts w:ascii="Times New Roman" w:hAnsi="Times New Roman" w:eastAsia="Times New Roman" w:cs="Times New Roman"/>
+      <w:rFonts w:eastAsiaTheme="majorEastAsia" w:cstheme="majorBidi"/>
       <w:spacing w:val="15"/>
       <w:sz w:val="28"/>
       <w:szCs w:val="28"/>
@@ -1532,8 +3434,8 @@
     <w:uiPriority w:val="11"/>
     <w:rsid w:val="00A10FD9"/>
     <w:rPr>
-      <w:rFonts w:ascii="Times New Roman" w:hAnsi="Times New Roman" w:eastAsia="Times New Roman" w:cs="Times New Roman"/>
-      <w:color w:val="000000"/>
+      <w:rFonts w:eastAsiaTheme="majorEastAsia" w:cstheme="majorBidi"/>
+      <w:color w:val="595959" w:themeColor="text1" w:themeTint="A6"/>
       <w:spacing w:val="15"/>
       <w:sz w:val="28"/>
       <w:szCs w:val="28"/>
@@ -1618,14 +3520,17 @@
     <w:pPr>
       <w:keepNext/>
       <w:keepLines/>
-      <w:spacing w:before="644" w:after="644" w:line="240" w:lineRule="auto"/>
+      <w:spacing w:before="322" w:after="322" w:line="322" w:lineRule="exact"/>
+      <w:ind w:firstLine="0"/>
       <w:jc w:val="center"/>
+      <w:outlineLvl w:val="0"/>
     </w:pPr>
     <w:rPr>
       <w:rFonts w:ascii="Times New Roman" w:hAnsi="Times New Roman" w:eastAsia="Times New Roman" w:cs="Times New Roman"/>
       <w:b/>
       <w:bCs/>
       <w:caps/>
+      <w:color w:val="000000"/>
       <w:sz w:val="28"/>
       <w:szCs w:val="28"/>
     </w:rPr>
@@ -1643,13 +3548,15 @@
     <w:pPr>
       <w:keepNext/>
       <w:keepLines/>
-      <w:spacing w:before="644" w:after="644" w:line="240" w:lineRule="auto"/>
-      <w:jc w:val="center"/>
+      <w:spacing w:before="322" w:after="322" w:line="322" w:lineRule="exact"/>
+      <w:ind w:firstLine="0"/>
+      <w:outlineLvl w:val="1"/>
     </w:pPr>
     <w:rPr>
       <w:rFonts w:ascii="Times New Roman" w:hAnsi="Times New Roman" w:eastAsia="Times New Roman" w:cs="Times New Roman"/>
       <w:b/>
       <w:bCs/>
+      <w:color w:val="000000"/>
       <w:sz w:val="28"/>
       <w:szCs w:val="28"/>
     </w:rPr>
@@ -1667,12 +3574,15 @@
     <w:pPr>
       <w:keepNext/>
       <w:keepLines/>
-      <w:spacing w:before="644" w:after="644" w:line="240" w:lineRule="auto"/>
+      <w:spacing w:before="322" w:after="322" w:line="322" w:lineRule="exact"/>
+      <w:ind w:firstLine="0"/>
+      <w:outlineLvl w:val="2"/>
     </w:pPr>
     <w:rPr>
       <w:rFonts w:ascii="Times New Roman" w:hAnsi="Times New Roman" w:eastAsia="Times New Roman" w:cs="Times New Roman"/>
       <w:b/>
       <w:bCs/>
+      <w:color w:val="000000"/>
       <w:sz w:val="28"/>
       <w:szCs w:val="28"/>
     </w:rPr>
@@ -1690,14 +3600,18 @@
     <w:pPr>
       <w:keepNext/>
       <w:keepLines/>
-      <w:spacing w:before="80" w:after="40"/>
+      <w:spacing w:before="322" w:after="322" w:line="322" w:lineRule="exact"/>
+      <w:ind w:firstLine="0"/>
       <w:outlineLvl w:val="3"/>
     </w:pPr>
     <w:rPr>
       <w:rFonts w:ascii="Times New Roman" w:hAnsi="Times New Roman" w:eastAsia="Times New Roman" w:cs="Times New Roman"/>
+      <w:b/>
+      <w:bCs/>
       <w:i/>
-      <w:iCs/>
       <w:color w:val="000000"/>
+      <w:sz w:val="28"/>
+      <w:szCs w:val="28"/>
     </w:rPr>
   </w:style>
   <w:style w:type="paragraph" w:styleId="Heading5">
@@ -1713,12 +3627,18 @@
     <w:pPr>
       <w:keepNext/>
       <w:keepLines/>
-      <w:spacing w:before="80" w:after="40"/>
+      <w:spacing w:before="322" w:after="322" w:line="322" w:lineRule="exact"/>
+      <w:ind w:firstLine="0"/>
       <w:outlineLvl w:val="4"/>
     </w:pPr>
     <w:rPr>
       <w:rFonts w:ascii="Times New Roman" w:hAnsi="Times New Roman" w:eastAsia="Times New Roman" w:cs="Times New Roman"/>
+      <w:b/>
+      <w:bCs/>
+      <w:i/>
       <w:color w:val="000000"/>
+      <w:sz w:val="28"/>
+      <w:szCs w:val="28"/>
     </w:rPr>
   </w:style>
   <w:style w:type="paragraph" w:styleId="Heading6">
@@ -1738,10 +3658,10 @@
       <w:outlineLvl w:val="5"/>
     </w:pPr>
     <w:rPr>
-      <w:rFonts w:ascii="Times New Roman" w:hAnsi="Times New Roman" w:eastAsia="Times New Roman" w:cs="Times New Roman"/>
+      <w:rFonts w:eastAsiaTheme="majorEastAsia" w:cstheme="majorBidi"/>
       <w:i/>
       <w:iCs/>
-      <w:color w:val="000000"/>
+      <w:color w:val="595959" w:themeColor="text1" w:themeTint="A6"/>
     </w:rPr>
   </w:style>
   <w:style w:type="paragraph" w:styleId="Heading7">
@@ -1761,8 +3681,8 @@
       <w:outlineLvl w:val="6"/>
     </w:pPr>
     <w:rPr>
-      <w:rFonts w:ascii="Times New Roman" w:hAnsi="Times New Roman" w:eastAsia="Times New Roman" w:cs="Times New Roman"/>
-      <w:color w:val="000000"/>
+      <w:rFonts w:eastAsiaTheme="majorEastAsia" w:cstheme="majorBidi"/>
+      <w:color w:val="595959" w:themeColor="text1" w:themeTint="A6"/>
     </w:rPr>
   </w:style>
   <w:style w:type="paragraph" w:styleId="Heading8">
@@ -1782,10 +3702,10 @@
       <w:outlineLvl w:val="7"/>
     </w:pPr>
     <w:rPr>
-      <w:rFonts w:ascii="Times New Roman" w:hAnsi="Times New Roman" w:eastAsia="Times New Roman" w:cs="Times New Roman"/>
+      <w:rFonts w:eastAsiaTheme="majorEastAsia" w:cstheme="majorBidi"/>
       <w:i/>
       <w:iCs/>
-      <w:color w:val="000000"/>
+      <w:color w:val="272727" w:themeColor="text1" w:themeTint="D8"/>
     </w:rPr>
   </w:style>
   <w:style w:type="paragraph" w:styleId="Heading9">
@@ -1805,8 +3725,8 @@
       <w:outlineLvl w:val="8"/>
     </w:pPr>
     <w:rPr>
-      <w:rFonts w:ascii="Times New Roman" w:hAnsi="Times New Roman" w:eastAsia="Times New Roman" w:cs="Times New Roman"/>
-      <w:color w:val="000000"/>
+      <w:rFonts w:eastAsiaTheme="majorEastAsia" w:cstheme="majorBidi"/>
+      <w:color w:val="272727" w:themeColor="text1" w:themeTint="D8"/>
     </w:rPr>
   </w:style>
   <w:style w:type="character" w:customStyle="1" w:styleId="Heading1Char">
@@ -1816,8 +3736,8 @@
     <w:uiPriority w:val="9"/>
     <w:rsid w:val="00A10FD9"/>
     <w:rPr>
-      <w:rFonts w:ascii="Times New Roman" w:hAnsi="Times New Roman" w:eastAsia="Times New Roman" w:cs="Times New Roman"/>
-      <w:color w:val="000000"/>
+      <w:rFonts w:asciiTheme="majorHAnsi" w:eastAsiaTheme="majorEastAsia" w:hAnsiTheme="majorHAnsi" w:cstheme="majorBidi"/>
+      <w:color w:val="0F4761" w:themeColor="accent1" w:themeShade="BF"/>
       <w:sz w:val="40"/>
       <w:szCs w:val="40"/>
     </w:rPr>
@@ -1830,8 +3750,8 @@
     <w:semiHidden/>
     <w:rsid w:val="00A10FD9"/>
     <w:rPr>
-      <w:rFonts w:ascii="Times New Roman" w:hAnsi="Times New Roman" w:eastAsia="Times New Roman" w:cs="Times New Roman"/>
-      <w:color w:val="000000"/>
+      <w:rFonts w:asciiTheme="majorHAnsi" w:eastAsiaTheme="majorEastAsia" w:hAnsiTheme="majorHAnsi" w:cstheme="majorBidi"/>
+      <w:color w:val="0F4761" w:themeColor="accent1" w:themeShade="BF"/>
       <w:sz w:val="32"/>
       <w:szCs w:val="32"/>
     </w:rPr>
@@ -1844,8 +3764,8 @@
     <w:semiHidden/>
     <w:rsid w:val="00A10FD9"/>
     <w:rPr>
-      <w:rFonts w:ascii="Times New Roman" w:hAnsi="Times New Roman" w:eastAsia="Times New Roman" w:cs="Times New Roman"/>
-      <w:color w:val="000000"/>
+      <w:rFonts w:eastAsiaTheme="majorEastAsia" w:cstheme="majorBidi"/>
+      <w:color w:val="0F4761" w:themeColor="accent1" w:themeShade="BF"/>
       <w:sz w:val="28"/>
       <w:szCs w:val="28"/>
     </w:rPr>
@@ -1858,10 +3778,10 @@
     <w:semiHidden/>
     <w:rsid w:val="00A10FD9"/>
     <w:rPr>
-      <w:rFonts w:ascii="Times New Roman" w:hAnsi="Times New Roman" w:eastAsia="Times New Roman" w:cs="Times New Roman"/>
+      <w:rFonts w:eastAsiaTheme="majorEastAsia" w:cstheme="majorBidi"/>
       <w:i/>
       <w:iCs/>
-      <w:color w:val="000000"/>
+      <w:color w:val="0F4761" w:themeColor="accent1" w:themeShade="BF"/>
     </w:rPr>
   </w:style>
   <w:style w:type="character" w:customStyle="1" w:styleId="Heading5Char">
@@ -1872,8 +3792,8 @@
     <w:semiHidden/>
     <w:rsid w:val="00A10FD9"/>
     <w:rPr>
-      <w:rFonts w:ascii="Times New Roman" w:hAnsi="Times New Roman" w:eastAsia="Times New Roman" w:cs="Times New Roman"/>
-      <w:color w:val="000000"/>
+      <w:rFonts w:eastAsiaTheme="majorEastAsia" w:cstheme="majorBidi"/>
+      <w:color w:val="0F4761" w:themeColor="accent1" w:themeShade="BF"/>
     </w:rPr>
   </w:style>
   <w:style w:type="character" w:customStyle="1" w:styleId="Heading6Char">
@@ -1884,10 +3804,10 @@
     <w:semiHidden/>
     <w:rsid w:val="00A10FD9"/>
     <w:rPr>
-      <w:rFonts w:ascii="Times New Roman" w:hAnsi="Times New Roman" w:eastAsia="Times New Roman" w:cs="Times New Roman"/>
+      <w:rFonts w:eastAsiaTheme="majorEastAsia" w:cstheme="majorBidi"/>
       <w:i/>
       <w:iCs/>
-      <w:color w:val="000000"/>
+      <w:color w:val="595959" w:themeColor="text1" w:themeTint="A6"/>
     </w:rPr>
   </w:style>
   <w:style w:type="character" w:customStyle="1" w:styleId="Heading7Char">
@@ -1898,8 +3818,8 @@
     <w:semiHidden/>
     <w:rsid w:val="00A10FD9"/>
     <w:rPr>
-      <w:rFonts w:ascii="Times New Roman" w:hAnsi="Times New Roman" w:eastAsia="Times New Roman" w:cs="Times New Roman"/>
-      <w:color w:val="000000"/>
+      <w:rFonts w:eastAsiaTheme="majorEastAsia" w:cstheme="majorBidi"/>
+      <w:color w:val="595959" w:themeColor="text1" w:themeTint="A6"/>
     </w:rPr>
   </w:style>
   <w:style w:type="character" w:customStyle="1" w:styleId="Heading8Char">
@@ -1910,10 +3830,10 @@
     <w:semiHidden/>
     <w:rsid w:val="00A10FD9"/>
     <w:rPr>
-      <w:rFonts w:ascii="Times New Roman" w:hAnsi="Times New Roman" w:eastAsia="Times New Roman" w:cs="Times New Roman"/>
+      <w:rFonts w:eastAsiaTheme="majorEastAsia" w:cstheme="majorBidi"/>
       <w:i/>
       <w:iCs/>
-      <w:color w:val="000000"/>
+      <w:color w:val="272727" w:themeColor="text1" w:themeTint="D8"/>
     </w:rPr>
   </w:style>
   <w:style w:type="character" w:customStyle="1" w:styleId="Heading9Char">
@@ -1924,9 +3844,18 @@
     <w:semiHidden/>
     <w:rsid w:val="00A10FD9"/>
     <w:rPr>
-      <w:rFonts w:ascii="Times New Roman" w:hAnsi="Times New Roman" w:eastAsia="Times New Roman" w:cs="Times New Roman"/>
-      <w:color w:val="000000"/>
-    </w:rPr>
+      <w:rFonts w:eastAsiaTheme="majorEastAsia" w:cstheme="majorBidi"/>
+      <w:color w:val="272727" w:themeColor="text1" w:themeTint="D8"/>
+    </w:rPr>
+  </w:style>
+  <w:style w:type="paragraph" w:customStyle="1" w:styleId="ListItem">
+    <w:name w:val="List Item"/>
+    <w:basedOn w:val="BodyText"/>
+    <w:qFormat/>
+    <w:pPr>
+      <w:spacing w:before="0" w:after="0" w:line="644" w:lineRule="exact"/>
+      <w:ind w:left="720" w:hanging="720"/>
+    </w:pPr>
   </w:style>
   <w:style w:type="paragraph" w:styleId="BlockText">
     <w:name w:val="Block Text"/>
@@ -1936,14 +3865,9 @@
     <w:unhideWhenUsed/>
     <w:qFormat/>
     <w:pPr>
-      <w:spacing w:before="0" w:after="644" w:line="240" w:lineRule="auto"/>
-      <w:ind w:left="720" w:right="720"/>
+      <w:spacing w:before="280" w:after="280" w:line="322" w:lineRule="exact"/>
+      <w:ind w:firstLine="0" w:left="720" w:right="720"/>
     </w:pPr>
-    <w:rPr>
-      <w:rFonts w:ascii="Times New Roman" w:hAnsi="Times New Roman" w:eastAsia="Times New Roman" w:cs="Times New Roman"/>
-      <w:sz w:val="28"/>
-      <w:szCs w:val="28"/>
-    </w:rPr>
   </w:style>
   <w:style w:type="paragraph" w:styleId="FootnoteText">
     <w:name w:val="Footnote Text"/>
@@ -1953,10 +3877,10 @@
     <w:unhideWhenUsed/>
     <w:qFormat/>
     <w:pPr>
-      <w:spacing w:before="0" w:after="80" w:line="240" w:lineRule="auto"/>
+      <w:keepLines/>
+      <w:spacing w:before="0" w:after="140" w:line="322" w:lineRule="exact"/>
     </w:pPr>
     <w:rPr>
-      <w:rFonts w:ascii="Times New Roman" w:hAnsi="Times New Roman" w:eastAsia="Times New Roman" w:cs="Times New Roman"/>
       <w:sz w:val="28"/>
       <w:szCs w:val="28"/>
     </w:rPr>
@@ -1969,8 +3893,8 @@
     <w:unhideWhenUsed/>
     <w:qFormat/>
     <w:pPr>
-      <w:spacing w:before="100" w:after="100"/>
-      <w:ind w:firstLine="0" w:left="480" w:right="480"/>
+      <w:spacing w:before="280" w:after="280"/>
+      <w:ind w:firstLine="0" w:left="720" w:right="720"/>
     </w:pPr>
   </w:style>
   <w:style w:type="character" w:default="1" w:styleId="DefaultParagraphFont">
@@ -2059,7 +3983,7 @@
     <w:name w:val="Verbatim Char"/>
     <w:basedOn w:val="BodyTextChar"/>
     <w:rPr>
-      <w:rFonts w:ascii="Times New Roman" w:hAnsi="Times New Roman" w:eastAsia="Times New Roman" w:cs="Times New Roman"/>
+      <w:rFonts w:ascii="Consolas" w:hAnsi="Consolas"/>
       <w:sz w:val="22"/>
     </w:rPr>
   </w:style>
@@ -2093,215 +4017,10 @@
       <w:outlineLvl w:val="9"/>
     </w:pPr>
     <w:rPr>
-      <w:rFonts w:ascii="Times New Roman" w:hAnsi="Times New Roman" w:eastAsia="Times New Roman" w:cs="Times New Roman"/>
+      <w:rFonts w:asciiTheme="majorHAnsi" w:eastAsiaTheme="majorEastAsia" w:hAnsiTheme="majorHAnsi" w:cstheme="majorBidi"/>
       <w:b w:val="0"/>
       <w:bCs w:val="0"/>
-      <w:color w:val="000000"/>
-    </w:rPr>
-  </w:style>
-  <w:style w:type="paragraph" w:customStyle="1" w:styleId="GANDNumbered">
-    <w:name w:val="GAND Numbered"/>
-    <w:basedOn w:val="BodyText"/>
-    <w:qFormat/>
-    <w:pPr>
-      <w:tabs>
-        <w:tab w:val="left" w:pos="1440"/>
-      </w:tabs>
-      <w:spacing w:before="0" w:after="0" w:line="644" w:lineRule="exact"/>
-      <w:ind w:firstLine="720"/>
-    </w:pPr>
-    <w:rPr>
-      <w:rFonts w:ascii="Times New Roman" w:hAnsi="Times New Roman" w:eastAsia="Times New Roman" w:cs="Times New Roman"/>
-      <w:sz w:val="28"/>
-      <w:szCs w:val="28"/>
-    </w:rPr>
-  </w:style>
-  <w:style w:type="paragraph" w:customStyle="1" w:styleId="GANDLettered">
-    <w:name w:val="GAND Lettered"/>
-    <w:basedOn w:val="BodyText"/>
-    <w:qFormat/>
-    <w:pPr>
-      <w:tabs>
-        <w:tab w:val="left" w:pos="1440"/>
-      </w:tabs>
-      <w:spacing w:before="0" w:after="0" w:line="644" w:lineRule="exact"/>
-      <w:ind w:left="1440" w:hanging="720"/>
-    </w:pPr>
-    <w:rPr>
-      <w:rFonts w:ascii="Times New Roman" w:hAnsi="Times New Roman" w:eastAsia="Times New Roman" w:cs="Times New Roman"/>
-      <w:sz w:val="28"/>
-      <w:szCs w:val="28"/>
-    </w:rPr>
-  </w:style>
-  <w:style w:type="paragraph" w:customStyle="1" w:styleId="GANDCourtTitle">
-    <w:name w:val="GAND Court Title"/>
-    <w:basedOn w:val="Normal"/>
-    <w:qFormat/>
-    <w:pPr>
-      <w:keepNext/>
-      <w:keepLines/>
-      <w:spacing w:before="0" w:after="0" w:line="240" w:lineRule="auto"/>
-      <w:jc w:val="center"/>
-    </w:pPr>
-    <w:rPr>
-      <w:rFonts w:ascii="Times New Roman" w:hAnsi="Times New Roman" w:eastAsia="Times New Roman" w:cs="Times New Roman"/>
-      <w:b/>
-      <w:bCs/>
-      <w:sz w:val="28"/>
-      <w:szCs w:val="28"/>
-    </w:rPr>
-  </w:style>
-  <w:style w:type="paragraph" w:customStyle="1" w:styleId="GANDCourtTitleLast">
-    <w:name w:val="GAND Court Title Last"/>
-    <w:basedOn w:val="GANDCourtTitle"/>
-    <w:qFormat/>
-    <w:pPr>
-      <w:spacing w:before="0" w:after="644" w:line="240" w:lineRule="auto"/>
-    </w:pPr>
-    <w:rPr/>
-  </w:style>
-  <w:style w:type="paragraph" w:customStyle="1" w:styleId="GANDCoverTitle">
-    <w:name w:val="GAND Cover Title"/>
-    <w:basedOn w:val="Normal"/>
-    <w:qFormat/>
-    <w:pPr>
-      <w:keepNext/>
-      <w:keepLines/>
-      <w:spacing w:before="644" w:after="644" w:line="240" w:lineRule="auto"/>
-      <w:jc w:val="center"/>
-    </w:pPr>
-    <w:rPr>
-      <w:rFonts w:ascii="Times New Roman" w:hAnsi="Times New Roman" w:eastAsia="Times New Roman" w:cs="Times New Roman"/>
-      <w:b/>
-      <w:bCs/>
-      <w:caps/>
-      <w:sz w:val="28"/>
-      <w:szCs w:val="28"/>
-    </w:rPr>
-  </w:style>
-  <w:style w:type="paragraph" w:customStyle="1" w:styleId="GANDCaption">
-    <w:name w:val="GAND Caption"/>
-    <w:basedOn w:val="Normal"/>
-    <w:qFormat/>
-    <w:pPr>
-      <w:spacing w:before="0" w:after="0" w:line="392" w:lineRule="exact"/>
-    </w:pPr>
-    <w:rPr>
-      <w:rFonts w:ascii="Times New Roman" w:hAnsi="Times New Roman" w:eastAsia="Times New Roman" w:cs="Times New Roman"/>
-      <w:sz w:val="28"/>
-      <w:szCs w:val="28"/>
-    </w:rPr>
-  </w:style>
-  <w:style w:type="paragraph" w:customStyle="1" w:styleId="GANDSignatureLead">
-    <w:name w:val="GAND Signature Lead"/>
-    <w:basedOn w:val="Normal"/>
-    <w:qFormat/>
-    <w:pPr>
-      <w:keepNext/>
-      <w:keepLines/>
-      <w:spacing w:before="644" w:after="0" w:line="240" w:lineRule="auto"/>
-    </w:pPr>
-    <w:rPr>
-      <w:rFonts w:ascii="Times New Roman" w:hAnsi="Times New Roman" w:eastAsia="Times New Roman" w:cs="Times New Roman"/>
-      <w:sz w:val="28"/>
-      <w:szCs w:val="28"/>
-    </w:rPr>
-  </w:style>
-  <w:style w:type="paragraph" w:customStyle="1" w:styleId="GANDSignatureBlockLead">
-    <w:name w:val="GAND Signature Block Lead"/>
-    <w:basedOn w:val="Normal"/>
-    <w:qFormat/>
-    <w:pPr>
-      <w:keepNext/>
-      <w:keepLines/>
-      <w:spacing w:before="644" w:after="0" w:line="240" w:lineRule="auto"/>
-      <w:ind w:left="3888"/>
-    </w:pPr>
-    <w:rPr>
-      <w:rFonts w:ascii="Times New Roman" w:hAnsi="Times New Roman" w:eastAsia="Times New Roman" w:cs="Times New Roman"/>
-      <w:sz w:val="28"/>
-      <w:szCs w:val="28"/>
-    </w:rPr>
-  </w:style>
-  <w:style w:type="paragraph" w:customStyle="1" w:styleId="GANDSignatureBlock">
-    <w:name w:val="GAND Signature Block"/>
-    <w:basedOn w:val="Normal"/>
-    <w:qFormat/>
-    <w:pPr>
-      <w:keepNext/>
-      <w:keepLines/>
-      <w:spacing w:before="0" w:after="0" w:line="240" w:lineRule="auto"/>
-      <w:ind w:left="3888"/>
-    </w:pPr>
-    <w:rPr>
-      <w:rFonts w:ascii="Times New Roman" w:hAnsi="Times New Roman" w:eastAsia="Times New Roman" w:cs="Times New Roman"/>
-      <w:sz w:val="28"/>
-      <w:szCs w:val="28"/>
-    </w:rPr>
-  </w:style>
-  <w:style w:type="paragraph" w:customStyle="1" w:styleId="GANDSignatureGap">
-    <w:name w:val="GAND Signature Gap"/>
-    <w:basedOn w:val="Normal"/>
-    <w:qFormat/>
-    <w:pPr>
-      <w:keepNext/>
-      <w:keepLines/>
-      <w:spacing w:before="80" w:after="0" w:line="240" w:lineRule="auto"/>
-      <w:ind w:left="3888"/>
-    </w:pPr>
-    <w:rPr>
-      <w:rFonts w:ascii="Times New Roman" w:hAnsi="Times New Roman" w:eastAsia="Times New Roman" w:cs="Times New Roman"/>
-      <w:sz w:val="28"/>
-      <w:szCs w:val="28"/>
-    </w:rPr>
-  </w:style>
-  <w:style w:type="paragraph" w:customStyle="1" w:styleId="GANDSignatureRight">
-    <w:name w:val="GAND Signature Right"/>
-    <w:basedOn w:val="Normal"/>
-    <w:qFormat/>
-    <w:pPr>
-      <w:keepLines/>
-      <w:spacing w:before="0" w:after="0" w:line="240" w:lineRule="auto"/>
-      <w:jc w:val="right"/>
-    </w:pPr>
-    <w:rPr>
-      <w:rFonts w:ascii="Times New Roman" w:hAnsi="Times New Roman" w:eastAsia="Times New Roman" w:cs="Times New Roman"/>
-      <w:sz w:val="28"/>
-      <w:szCs w:val="28"/>
-    </w:rPr>
-  </w:style>
-  <w:style w:type="paragraph" w:customStyle="1" w:styleId="GANDCertificateHeading">
-    <w:name w:val="GAND Certificate Heading"/>
-    <w:basedOn w:val="Normal"/>
-    <w:qFormat/>
-    <w:pPr>
-      <w:keepNext/>
-      <w:keepLines/>
-      <w:spacing w:before="644" w:after="644" w:line="240" w:lineRule="auto"/>
-      <w:jc w:val="center"/>
-    </w:pPr>
-    <w:rPr>
-      <w:rFonts w:ascii="Times New Roman" w:hAnsi="Times New Roman" w:eastAsia="Times New Roman" w:cs="Times New Roman"/>
-      <w:b/>
-      <w:bCs/>
-      <w:sz w:val="28"/>
-      <w:szCs w:val="28"/>
-    </w:rPr>
-  </w:style>
-  <w:style w:type="paragraph" w:customStyle="1" w:styleId="GANDCertificateBody">
-    <w:name w:val="GAND Certificate Body"/>
-    <w:basedOn w:val="BodyText"/>
-    <w:qFormat/>
-    <w:pPr>
-      <w:keepNext/>
-      <w:keepLines/>
-      <w:spacing w:before="0" w:after="644" w:line="644" w:lineRule="exact"/>
-      <w:ind w:firstLine="720"/>
-    </w:pPr>
-    <w:rPr>
-      <w:rFonts w:ascii="Times New Roman" w:hAnsi="Times New Roman" w:eastAsia="Times New Roman" w:cs="Times New Roman"/>
-      <w:sz w:val="28"/>
-      <w:szCs w:val="28"/>
+      <w:color w:val="365F91" w:themeColor="accent1" w:themeShade="BF"/>
     </w:rPr>
   </w:style>
   <w:style w:type="paragraph" w:customStyle="1" w:styleId="SourceCode">

</xml_diff>